<commit_message>
Pharmacology I Exam 2: Lecture 8 (Myocardial Ischemia) full build
Antianginal and ACS/fibrinolytic charts (+ L8 rows in indications, side effects, contraindications, killers), study guide section 5 with 36 star boxes, cram sheet +62 rows, 4 topic quizzes (2 versions each), MI vignette pair, MI drill (master drill now 158), 2 Arcade decks, 40 recording-emphasis entries on what-to-star, guide links (9,317/9,317 strict), docx copies. Master exams not built. Truth-wins conflicts flagged in the guide (contested slide cells not keyed).

Co-Authored-By: Claude Sonnet 5.5 <noreply@anthropic.com>
</commit_message>
<xml_diff>
--- a/Pharmacology I Exam 2/pharm-exam-2-contraindications.docx
+++ b/Pharmacology I Exam 2/pharm-exam-2-contraindications.docx
@@ -62,7 +62,7 @@
           <w:b w:val="0"/>
           <w:i w:val="0"/>
         </w:rPr>
-        <w:t>When NOT to give each drug. 94 entries across the Exam 2 lectures, each citing its slide and tiered by the strength of the slide’s own wording.</w:t>
+        <w:t>When NOT to give each drug. 119 entries across the Exam 2 lectures, each citing its slide and tiered by the strength of the slide’s own wording.</w:t>
       </w:r>
     </w:p>
     <w:p>
@@ -13184,6 +13184,3466 @@
                 <w:sz w:val="18"/>
               </w:rPr>
               <w:t>slide 60</w:t>
+            </w:r>
+          </w:p>
+        </w:tc>
+      </w:tr>
+    </w:tbl>
+    <w:p>
+      <w:pPr>
+        <w:spacing w:after="80"/>
+      </w:pPr>
+    </w:p>
+    <w:p>
+      <w:pPr>
+        <w:pStyle w:val="Heading1"/>
+        <w:spacing w:before="280" w:after="100"/>
+      </w:pPr>
+      <w:r>
+        <w:rPr>
+          <w:rFonts w:ascii="Georgia" w:hAnsi="Georgia"/>
+          <w:color w:val="6B3524"/>
+        </w:rPr>
+        <w:t>Lecture 8 — Myocardial Ischemia Drug Therapy 25 entries</w:t>
+      </w:r>
+    </w:p>
+    <w:tbl>
+      <w:tblPr>
+        <w:tblStyle w:val="TableGrid"/>
+        <w:tblW w:type="auto" w:w="0"/>
+        <w:jc w:val="center"/>
+        <w:tblLook w:firstColumn="1" w:firstRow="1" w:lastColumn="0" w:lastRow="0" w:noHBand="0" w:noVBand="1" w:val="04A0"/>
+        <w:tblBorders>
+          <w:top w:val="single" w:sz="4" w:space="0" w:color="D8D2D4"/>
+          <w:left w:val="single" w:sz="4" w:space="0" w:color="D8D2D4"/>
+          <w:bottom w:val="single" w:sz="4" w:space="0" w:color="D8D2D4"/>
+          <w:right w:val="single" w:sz="4" w:space="0" w:color="D8D2D4"/>
+          <w:insideH w:val="single" w:sz="4" w:space="0" w:color="D8D2D4"/>
+          <w:insideV w:val="single" w:sz="4" w:space="0" w:color="D8D2D4"/>
+        </w:tblBorders>
+      </w:tblPr>
+      <w:tblGrid>
+        <w:gridCol w:w="2556"/>
+        <w:gridCol w:w="2556"/>
+        <w:gridCol w:w="2556"/>
+        <w:gridCol w:w="2556"/>
+      </w:tblGrid>
+      <w:tr>
+        <w:tc>
+          <w:tcPr>
+            <w:tcW w:type="dxa" w:w="2556"/>
+            <w:shd w:val="clear" w:color="auto" w:fill="6B3524"/>
+          </w:tcPr>
+          <w:p>
+            <w:pPr>
+              <w:spacing w:after="40"/>
+            </w:pPr>
+            <w:r>
+              <w:rPr>
+                <w:b/>
+                <w:color w:val="FFFFFF"/>
+                <w:sz w:val="18"/>
+              </w:rPr>
+            </w:r>
+            <w:r>
+              <w:rPr>
+                <w:b/>
+                <w:i w:val="0"/>
+                <w:color w:val="FFFFFF"/>
+                <w:sz w:val="18"/>
+              </w:rPr>
+              <w:t>Drug or class</w:t>
+            </w:r>
+          </w:p>
+        </w:tc>
+        <w:tc>
+          <w:tcPr>
+            <w:tcW w:type="dxa" w:w="2556"/>
+            <w:shd w:val="clear" w:color="auto" w:fill="6B3524"/>
+          </w:tcPr>
+          <w:p>
+            <w:pPr>
+              <w:spacing w:after="40"/>
+            </w:pPr>
+            <w:r>
+              <w:rPr>
+                <w:b/>
+                <w:color w:val="FFFFFF"/>
+                <w:sz w:val="18"/>
+              </w:rPr>
+            </w:r>
+            <w:r>
+              <w:rPr>
+                <w:b/>
+                <w:i w:val="0"/>
+                <w:color w:val="FFFFFF"/>
+                <w:sz w:val="18"/>
+              </w:rPr>
+              <w:t>Tier</w:t>
+            </w:r>
+          </w:p>
+        </w:tc>
+        <w:tc>
+          <w:tcPr>
+            <w:tcW w:type="dxa" w:w="2556"/>
+            <w:shd w:val="clear" w:color="auto" w:fill="6B3524"/>
+          </w:tcPr>
+          <w:p>
+            <w:pPr>
+              <w:spacing w:after="40"/>
+            </w:pPr>
+            <w:r>
+              <w:rPr>
+                <w:b/>
+                <w:color w:val="FFFFFF"/>
+                <w:sz w:val="18"/>
+              </w:rPr>
+            </w:r>
+            <w:r>
+              <w:rPr>
+                <w:b/>
+                <w:i w:val="0"/>
+                <w:color w:val="FFFFFF"/>
+                <w:sz w:val="18"/>
+              </w:rPr>
+              <w:t>Do not use / caution</w:t>
+            </w:r>
+          </w:p>
+        </w:tc>
+        <w:tc>
+          <w:tcPr>
+            <w:tcW w:type="dxa" w:w="2556"/>
+            <w:shd w:val="clear" w:color="auto" w:fill="6B3524"/>
+          </w:tcPr>
+          <w:p>
+            <w:pPr>
+              <w:spacing w:after="40"/>
+            </w:pPr>
+            <w:r>
+              <w:rPr>
+                <w:b/>
+                <w:color w:val="FFFFFF"/>
+                <w:sz w:val="18"/>
+              </w:rPr>
+            </w:r>
+            <w:r>
+              <w:rPr>
+                <w:b/>
+                <w:i w:val="0"/>
+                <w:color w:val="FFFFFF"/>
+                <w:sz w:val="18"/>
+              </w:rPr>
+              <w:t>Source</w:t>
+            </w:r>
+          </w:p>
+        </w:tc>
+      </w:tr>
+      <w:tr>
+        <w:tc>
+          <w:tcPr>
+            <w:tcW w:type="dxa" w:w="10224"/>
+            <w:gridSpan w:val="4"/>
+          </w:tcPr>
+          <w:p>
+            <w:pPr>
+              <w:spacing w:after="40"/>
+            </w:pPr>
+            <w:r/>
+          </w:p>
+        </w:tc>
+      </w:tr>
+      <w:tr>
+        <w:tc>
+          <w:tcPr>
+            <w:tcW w:type="dxa" w:w="2556"/>
+          </w:tcPr>
+          <w:p>
+            <w:pPr>
+              <w:spacing w:after="40"/>
+            </w:pPr>
+            <w:r>
+              <w:rPr>
+                <w:sz w:val="18"/>
+              </w:rPr>
+            </w:r>
+            <w:r>
+              <w:rPr>
+                <w:b w:val="0"/>
+                <w:i w:val="0"/>
+                <w:sz w:val="18"/>
+              </w:rPr>
+              <w:t>Beta blockers</w:t>
+            </w:r>
+            <w:r>
+              <w:rPr>
+                <w:sz w:val="18"/>
+              </w:rPr>
+              <w:br/>
+            </w:r>
+            <w:r>
+              <w:rPr>
+                <w:b w:val="0"/>
+                <w:i w:val="0"/>
+                <w:sz w:val="18"/>
+              </w:rPr>
+              <w:t>metoprolol, atenolol (beta-1 selective); propranolol, nadolol (non-selective); carvedilol, labetalol (third generation)</w:t>
+            </w:r>
+          </w:p>
+        </w:tc>
+        <w:tc>
+          <w:tcPr>
+            <w:tcW w:type="dxa" w:w="2556"/>
+          </w:tcPr>
+          <w:p>
+            <w:pPr>
+              <w:spacing w:after="40"/>
+            </w:pPr>
+            <w:r>
+              <w:rPr>
+                <w:sz w:val="18"/>
+              </w:rPr>
+            </w:r>
+            <w:r>
+              <w:rPr>
+                <w:b w:val="0"/>
+                <w:i w:val="0"/>
+                <w:sz w:val="18"/>
+              </w:rPr>
+              <w:t>Contraindicated</w:t>
+            </w:r>
+          </w:p>
+        </w:tc>
+        <w:tc>
+          <w:tcPr>
+            <w:tcW w:type="dxa" w:w="2556"/>
+          </w:tcPr>
+          <w:p>
+            <w:pPr>
+              <w:spacing w:after="40"/>
+            </w:pPr>
+            <w:r>
+              <w:rPr>
+                <w:sz w:val="18"/>
+              </w:rPr>
+            </w:r>
+            <w:r>
+              <w:rPr>
+                <w:b/>
+                <w:i w:val="0"/>
+                <w:sz w:val="18"/>
+              </w:rPr>
+              <w:t>Contraindicated with heart rate below 60 beats per minute and with atrioventricular block.</w:t>
+            </w:r>
+          </w:p>
+        </w:tc>
+        <w:tc>
+          <w:tcPr>
+            <w:tcW w:type="dxa" w:w="2556"/>
+          </w:tcPr>
+          <w:p>
+            <w:pPr>
+              <w:spacing w:after="40"/>
+            </w:pPr>
+            <w:r>
+              <w:rPr>
+                <w:sz w:val="18"/>
+              </w:rPr>
+            </w:r>
+            <w:r>
+              <w:rPr>
+                <w:b w:val="0"/>
+                <w:i w:val="0"/>
+                <w:sz w:val="18"/>
+              </w:rPr>
+              <w:t>L8</w:t>
+            </w:r>
+            <w:r>
+              <w:rPr>
+                <w:sz w:val="18"/>
+              </w:rPr>
+              <w:br/>
+            </w:r>
+            <w:r>
+              <w:rPr>
+                <w:b w:val="0"/>
+                <w:i w:val="0"/>
+                <w:sz w:val="18"/>
+              </w:rPr>
+              <w:t>slide 18</w:t>
+            </w:r>
+          </w:p>
+        </w:tc>
+      </w:tr>
+      <w:tr>
+        <w:tc>
+          <w:tcPr>
+            <w:tcW w:type="dxa" w:w="2556"/>
+          </w:tcPr>
+          <w:p>
+            <w:pPr>
+              <w:spacing w:after="40"/>
+            </w:pPr>
+            <w:r>
+              <w:rPr>
+                <w:sz w:val="18"/>
+              </w:rPr>
+            </w:r>
+            <w:r>
+              <w:rPr>
+                <w:b w:val="0"/>
+                <w:i w:val="0"/>
+                <w:sz w:val="18"/>
+              </w:rPr>
+              <w:t>Beta blockers</w:t>
+            </w:r>
+            <w:r>
+              <w:rPr>
+                <w:sz w:val="18"/>
+              </w:rPr>
+              <w:br/>
+            </w:r>
+            <w:r>
+              <w:rPr>
+                <w:b w:val="0"/>
+                <w:i w:val="0"/>
+                <w:sz w:val="18"/>
+              </w:rPr>
+              <w:t>metoprolol, atenolol (beta-1 selective); propranolol, nadolol (non-selective); carvedilol, labetalol (third generation)</w:t>
+            </w:r>
+          </w:p>
+        </w:tc>
+        <w:tc>
+          <w:tcPr>
+            <w:tcW w:type="dxa" w:w="2556"/>
+          </w:tcPr>
+          <w:p>
+            <w:pPr>
+              <w:spacing w:after="40"/>
+            </w:pPr>
+            <w:r>
+              <w:rPr>
+                <w:sz w:val="18"/>
+              </w:rPr>
+            </w:r>
+            <w:r>
+              <w:rPr>
+                <w:b w:val="0"/>
+                <w:i w:val="0"/>
+                <w:sz w:val="18"/>
+              </w:rPr>
+              <w:t>Contraindicated</w:t>
+            </w:r>
+          </w:p>
+        </w:tc>
+        <w:tc>
+          <w:tcPr>
+            <w:tcW w:type="dxa" w:w="2556"/>
+          </w:tcPr>
+          <w:p>
+            <w:pPr>
+              <w:spacing w:after="40"/>
+            </w:pPr>
+            <w:r>
+              <w:rPr>
+                <w:sz w:val="18"/>
+              </w:rPr>
+            </w:r>
+            <w:r>
+              <w:rPr>
+                <w:b/>
+                <w:i w:val="0"/>
+                <w:sz w:val="18"/>
+              </w:rPr>
+              <w:t>Contraindicated with systolic blood pressure below 100 mmHg and in acute decompensated heart failure.</w:t>
+            </w:r>
+          </w:p>
+        </w:tc>
+        <w:tc>
+          <w:tcPr>
+            <w:tcW w:type="dxa" w:w="2556"/>
+          </w:tcPr>
+          <w:p>
+            <w:pPr>
+              <w:spacing w:after="40"/>
+            </w:pPr>
+            <w:r>
+              <w:rPr>
+                <w:sz w:val="18"/>
+              </w:rPr>
+            </w:r>
+            <w:r>
+              <w:rPr>
+                <w:b w:val="0"/>
+                <w:i w:val="0"/>
+                <w:sz w:val="18"/>
+              </w:rPr>
+              <w:t>L8</w:t>
+            </w:r>
+            <w:r>
+              <w:rPr>
+                <w:sz w:val="18"/>
+              </w:rPr>
+              <w:br/>
+            </w:r>
+            <w:r>
+              <w:rPr>
+                <w:b w:val="0"/>
+                <w:i w:val="0"/>
+                <w:sz w:val="18"/>
+              </w:rPr>
+              <w:t>slide 18</w:t>
+            </w:r>
+          </w:p>
+        </w:tc>
+      </w:tr>
+      <w:tr>
+        <w:tc>
+          <w:tcPr>
+            <w:tcW w:type="dxa" w:w="2556"/>
+          </w:tcPr>
+          <w:p>
+            <w:pPr>
+              <w:spacing w:after="40"/>
+            </w:pPr>
+            <w:r>
+              <w:rPr>
+                <w:sz w:val="18"/>
+              </w:rPr>
+            </w:r>
+            <w:r>
+              <w:rPr>
+                <w:b w:val="0"/>
+                <w:i w:val="0"/>
+                <w:sz w:val="18"/>
+              </w:rPr>
+              <w:t>Beta blockers</w:t>
+            </w:r>
+            <w:r>
+              <w:rPr>
+                <w:sz w:val="18"/>
+              </w:rPr>
+              <w:br/>
+            </w:r>
+            <w:r>
+              <w:rPr>
+                <w:b w:val="0"/>
+                <w:i w:val="0"/>
+                <w:sz w:val="18"/>
+              </w:rPr>
+              <w:t>metoprolol, atenolol (beta-1 selective); propranolol, nadolol (non-selective); carvedilol, labetalol (third generation)</w:t>
+            </w:r>
+          </w:p>
+        </w:tc>
+        <w:tc>
+          <w:tcPr>
+            <w:tcW w:type="dxa" w:w="2556"/>
+          </w:tcPr>
+          <w:p>
+            <w:pPr>
+              <w:spacing w:after="40"/>
+            </w:pPr>
+            <w:r>
+              <w:rPr>
+                <w:sz w:val="18"/>
+              </w:rPr>
+            </w:r>
+            <w:r>
+              <w:rPr>
+                <w:b w:val="0"/>
+                <w:i w:val="0"/>
+                <w:sz w:val="18"/>
+              </w:rPr>
+              <w:t>Caution</w:t>
+            </w:r>
+          </w:p>
+        </w:tc>
+        <w:tc>
+          <w:tcPr>
+            <w:tcW w:type="dxa" w:w="2556"/>
+          </w:tcPr>
+          <w:p>
+            <w:pPr>
+              <w:spacing w:after="40"/>
+            </w:pPr>
+            <w:r>
+              <w:rPr>
+                <w:sz w:val="18"/>
+              </w:rPr>
+            </w:r>
+            <w:r>
+              <w:rPr>
+                <w:b/>
+                <w:i w:val="0"/>
+                <w:sz w:val="18"/>
+              </w:rPr>
+              <w:t>Precautions: reactive airway disease, systolic heart failure, diabetes and peripheral vascular disease.</w:t>
+            </w:r>
+          </w:p>
+        </w:tc>
+        <w:tc>
+          <w:tcPr>
+            <w:tcW w:type="dxa" w:w="2556"/>
+          </w:tcPr>
+          <w:p>
+            <w:pPr>
+              <w:spacing w:after="40"/>
+            </w:pPr>
+            <w:r>
+              <w:rPr>
+                <w:sz w:val="18"/>
+              </w:rPr>
+            </w:r>
+            <w:r>
+              <w:rPr>
+                <w:b w:val="0"/>
+                <w:i w:val="0"/>
+                <w:sz w:val="18"/>
+              </w:rPr>
+              <w:t>L8</w:t>
+            </w:r>
+            <w:r>
+              <w:rPr>
+                <w:sz w:val="18"/>
+              </w:rPr>
+              <w:br/>
+            </w:r>
+            <w:r>
+              <w:rPr>
+                <w:b w:val="0"/>
+                <w:i w:val="0"/>
+                <w:sz w:val="18"/>
+              </w:rPr>
+              <w:t>slide 18</w:t>
+            </w:r>
+          </w:p>
+        </w:tc>
+      </w:tr>
+      <w:tr>
+        <w:tc>
+          <w:tcPr>
+            <w:tcW w:type="dxa" w:w="2556"/>
+          </w:tcPr>
+          <w:p>
+            <w:pPr>
+              <w:spacing w:after="40"/>
+            </w:pPr>
+            <w:r>
+              <w:rPr>
+                <w:sz w:val="18"/>
+              </w:rPr>
+            </w:r>
+            <w:r>
+              <w:rPr>
+                <w:b w:val="0"/>
+                <w:i w:val="0"/>
+                <w:sz w:val="18"/>
+              </w:rPr>
+              <w:t>Beta blockers</w:t>
+            </w:r>
+            <w:r>
+              <w:rPr>
+                <w:sz w:val="18"/>
+              </w:rPr>
+              <w:br/>
+            </w:r>
+            <w:r>
+              <w:rPr>
+                <w:b w:val="0"/>
+                <w:i w:val="0"/>
+                <w:sz w:val="18"/>
+              </w:rPr>
+              <w:t>metoprolol, atenolol (beta-1 selective); propranolol, nadolol (non-selective); carvedilol, labetalol (third generation)</w:t>
+            </w:r>
+          </w:p>
+        </w:tc>
+        <w:tc>
+          <w:tcPr>
+            <w:tcW w:type="dxa" w:w="2556"/>
+          </w:tcPr>
+          <w:p>
+            <w:pPr>
+              <w:spacing w:after="40"/>
+            </w:pPr>
+            <w:r>
+              <w:rPr>
+                <w:sz w:val="18"/>
+              </w:rPr>
+            </w:r>
+            <w:r>
+              <w:rPr>
+                <w:b w:val="0"/>
+                <w:i w:val="0"/>
+                <w:sz w:val="18"/>
+              </w:rPr>
+              <w:t>Avoid</w:t>
+            </w:r>
+          </w:p>
+        </w:tc>
+        <w:tc>
+          <w:tcPr>
+            <w:tcW w:type="dxa" w:w="2556"/>
+          </w:tcPr>
+          <w:p>
+            <w:pPr>
+              <w:spacing w:after="40"/>
+            </w:pPr>
+            <w:r>
+              <w:rPr>
+                <w:sz w:val="18"/>
+              </w:rPr>
+            </w:r>
+            <w:r>
+              <w:rPr>
+                <w:b/>
+                <w:i w:val="0"/>
+                <w:sz w:val="18"/>
+              </w:rPr>
+              <w:t>Avoid non-cardioselective beta blockers in asthma</w:t>
+            </w:r>
+            <w:r>
+              <w:rPr>
+                <w:b w:val="0"/>
+                <w:i w:val="0"/>
+                <w:sz w:val="18"/>
+              </w:rPr>
+              <w:t>; avoid beta blockers in bradycardia or atrioventricular block (a dihydropyridine is first line there).</w:t>
+            </w:r>
+          </w:p>
+        </w:tc>
+        <w:tc>
+          <w:tcPr>
+            <w:tcW w:type="dxa" w:w="2556"/>
+          </w:tcPr>
+          <w:p>
+            <w:pPr>
+              <w:spacing w:after="40"/>
+            </w:pPr>
+            <w:r>
+              <w:rPr>
+                <w:sz w:val="18"/>
+              </w:rPr>
+            </w:r>
+            <w:r>
+              <w:rPr>
+                <w:b w:val="0"/>
+                <w:i w:val="0"/>
+                <w:sz w:val="18"/>
+              </w:rPr>
+              <w:t>L8</w:t>
+            </w:r>
+            <w:r>
+              <w:rPr>
+                <w:sz w:val="18"/>
+              </w:rPr>
+              <w:br/>
+            </w:r>
+            <w:r>
+              <w:rPr>
+                <w:b w:val="0"/>
+                <w:i w:val="0"/>
+                <w:sz w:val="18"/>
+              </w:rPr>
+              <w:t>slide 34</w:t>
+            </w:r>
+          </w:p>
+        </w:tc>
+      </w:tr>
+      <w:tr>
+        <w:tc>
+          <w:tcPr>
+            <w:tcW w:type="dxa" w:w="2556"/>
+          </w:tcPr>
+          <w:p>
+            <w:pPr>
+              <w:spacing w:after="40"/>
+            </w:pPr>
+            <w:r>
+              <w:rPr>
+                <w:sz w:val="18"/>
+              </w:rPr>
+            </w:r>
+            <w:r>
+              <w:rPr>
+                <w:b w:val="0"/>
+                <w:i w:val="0"/>
+                <w:sz w:val="18"/>
+              </w:rPr>
+              <w:t>Beta blockers</w:t>
+            </w:r>
+            <w:r>
+              <w:rPr>
+                <w:sz w:val="18"/>
+              </w:rPr>
+              <w:br/>
+            </w:r>
+            <w:r>
+              <w:rPr>
+                <w:b w:val="0"/>
+                <w:i w:val="0"/>
+                <w:sz w:val="18"/>
+              </w:rPr>
+              <w:t>metoprolol, atenolol (beta-1 selective); propranolol, nadolol (non-selective); carvedilol, labetalol (third generation)</w:t>
+            </w:r>
+          </w:p>
+        </w:tc>
+        <w:tc>
+          <w:tcPr>
+            <w:tcW w:type="dxa" w:w="2556"/>
+          </w:tcPr>
+          <w:p>
+            <w:pPr>
+              <w:spacing w:after="40"/>
+            </w:pPr>
+            <w:r>
+              <w:rPr>
+                <w:sz w:val="18"/>
+              </w:rPr>
+            </w:r>
+            <w:r>
+              <w:rPr>
+                <w:b w:val="0"/>
+                <w:i w:val="0"/>
+                <w:sz w:val="18"/>
+              </w:rPr>
+              <w:t>Avoid</w:t>
+            </w:r>
+          </w:p>
+        </w:tc>
+        <w:tc>
+          <w:tcPr>
+            <w:tcW w:type="dxa" w:w="2556"/>
+          </w:tcPr>
+          <w:p>
+            <w:pPr>
+              <w:spacing w:after="40"/>
+            </w:pPr>
+            <w:r>
+              <w:rPr>
+                <w:sz w:val="18"/>
+              </w:rPr>
+            </w:r>
+            <w:r>
+              <w:rPr>
+                <w:b/>
+                <w:i w:val="0"/>
+                <w:sz w:val="18"/>
+              </w:rPr>
+              <w:t>Avoid in variant (vasospastic) angina</w:t>
+            </w:r>
+            <w:r>
+              <w:rPr>
+                <w:b w:val="0"/>
+                <w:i w:val="0"/>
+                <w:sz w:val="18"/>
+              </w:rPr>
+              <w:t>: beta blockers may lead to worsened symptoms.</w:t>
+            </w:r>
+          </w:p>
+        </w:tc>
+        <w:tc>
+          <w:tcPr>
+            <w:tcW w:type="dxa" w:w="2556"/>
+          </w:tcPr>
+          <w:p>
+            <w:pPr>
+              <w:spacing w:after="40"/>
+            </w:pPr>
+            <w:r>
+              <w:rPr>
+                <w:sz w:val="18"/>
+              </w:rPr>
+            </w:r>
+            <w:r>
+              <w:rPr>
+                <w:b w:val="0"/>
+                <w:i w:val="0"/>
+                <w:sz w:val="18"/>
+              </w:rPr>
+              <w:t>L8</w:t>
+            </w:r>
+            <w:r>
+              <w:rPr>
+                <w:sz w:val="18"/>
+              </w:rPr>
+              <w:br/>
+            </w:r>
+            <w:r>
+              <w:rPr>
+                <w:b w:val="0"/>
+                <w:i w:val="0"/>
+                <w:sz w:val="18"/>
+              </w:rPr>
+              <w:t>slide 39</w:t>
+            </w:r>
+          </w:p>
+        </w:tc>
+      </w:tr>
+      <w:tr>
+        <w:tc>
+          <w:tcPr>
+            <w:tcW w:type="dxa" w:w="2556"/>
+          </w:tcPr>
+          <w:p>
+            <w:pPr>
+              <w:spacing w:after="40"/>
+            </w:pPr>
+            <w:r>
+              <w:rPr>
+                <w:sz w:val="18"/>
+              </w:rPr>
+            </w:r>
+            <w:r>
+              <w:rPr>
+                <w:b w:val="0"/>
+                <w:i w:val="0"/>
+                <w:sz w:val="18"/>
+              </w:rPr>
+              <w:t>Beta blockers in acute coronary syndrome</w:t>
+            </w:r>
+          </w:p>
+        </w:tc>
+        <w:tc>
+          <w:tcPr>
+            <w:tcW w:type="dxa" w:w="2556"/>
+          </w:tcPr>
+          <w:p>
+            <w:pPr>
+              <w:spacing w:after="40"/>
+            </w:pPr>
+            <w:r>
+              <w:rPr>
+                <w:sz w:val="18"/>
+              </w:rPr>
+            </w:r>
+            <w:r>
+              <w:rPr>
+                <w:b w:val="0"/>
+                <w:i w:val="0"/>
+                <w:sz w:val="18"/>
+              </w:rPr>
+              <w:t>Caution</w:t>
+            </w:r>
+          </w:p>
+        </w:tc>
+        <w:tc>
+          <w:tcPr>
+            <w:tcW w:type="dxa" w:w="2556"/>
+          </w:tcPr>
+          <w:p>
+            <w:pPr>
+              <w:spacing w:after="40"/>
+            </w:pPr>
+            <w:r>
+              <w:rPr>
+                <w:sz w:val="18"/>
+              </w:rPr>
+            </w:r>
+            <w:r>
+              <w:rPr>
+                <w:b/>
+                <w:i w:val="0"/>
+                <w:sz w:val="18"/>
+              </w:rPr>
+              <w:t>Caution with bradycardia or hypotension, heart block and severe reactive airway disease.</w:t>
+            </w:r>
+          </w:p>
+        </w:tc>
+        <w:tc>
+          <w:tcPr>
+            <w:tcW w:type="dxa" w:w="2556"/>
+          </w:tcPr>
+          <w:p>
+            <w:pPr>
+              <w:spacing w:after="40"/>
+            </w:pPr>
+            <w:r>
+              <w:rPr>
+                <w:sz w:val="18"/>
+              </w:rPr>
+            </w:r>
+            <w:r>
+              <w:rPr>
+                <w:b w:val="0"/>
+                <w:i w:val="0"/>
+                <w:sz w:val="18"/>
+              </w:rPr>
+              <w:t>L8</w:t>
+            </w:r>
+            <w:r>
+              <w:rPr>
+                <w:sz w:val="18"/>
+              </w:rPr>
+              <w:br/>
+            </w:r>
+            <w:r>
+              <w:rPr>
+                <w:b w:val="0"/>
+                <w:i w:val="0"/>
+                <w:sz w:val="18"/>
+              </w:rPr>
+              <w:t>slide 55</w:t>
+            </w:r>
+          </w:p>
+        </w:tc>
+      </w:tr>
+      <w:tr>
+        <w:tc>
+          <w:tcPr>
+            <w:tcW w:type="dxa" w:w="10224"/>
+            <w:gridSpan w:val="4"/>
+          </w:tcPr>
+          <w:p>
+            <w:pPr>
+              <w:spacing w:after="40"/>
+            </w:pPr>
+            <w:r/>
+          </w:p>
+        </w:tc>
+      </w:tr>
+      <w:tr>
+        <w:tc>
+          <w:tcPr>
+            <w:tcW w:type="dxa" w:w="2556"/>
+          </w:tcPr>
+          <w:p>
+            <w:pPr>
+              <w:spacing w:after="40"/>
+            </w:pPr>
+            <w:r>
+              <w:rPr>
+                <w:sz w:val="18"/>
+              </w:rPr>
+            </w:r>
+            <w:r>
+              <w:rPr>
+                <w:b w:val="0"/>
+                <w:i w:val="0"/>
+                <w:sz w:val="18"/>
+              </w:rPr>
+              <w:t>Calcium channel blockers</w:t>
+            </w:r>
+            <w:r>
+              <w:rPr>
+                <w:sz w:val="18"/>
+              </w:rPr>
+              <w:br/>
+            </w:r>
+            <w:r>
+              <w:rPr>
+                <w:b w:val="0"/>
+                <w:i w:val="0"/>
+                <w:sz w:val="18"/>
+              </w:rPr>
+              <w:t>dihydropyridine and non-dihydropyridine</w:t>
+            </w:r>
+          </w:p>
+        </w:tc>
+        <w:tc>
+          <w:tcPr>
+            <w:tcW w:type="dxa" w:w="2556"/>
+          </w:tcPr>
+          <w:p>
+            <w:pPr>
+              <w:spacing w:after="40"/>
+            </w:pPr>
+            <w:r>
+              <w:rPr>
+                <w:sz w:val="18"/>
+              </w:rPr>
+            </w:r>
+            <w:r>
+              <w:rPr>
+                <w:b w:val="0"/>
+                <w:i w:val="0"/>
+                <w:sz w:val="18"/>
+              </w:rPr>
+              <w:t>Contraindicated</w:t>
+            </w:r>
+          </w:p>
+        </w:tc>
+        <w:tc>
+          <w:tcPr>
+            <w:tcW w:type="dxa" w:w="2556"/>
+          </w:tcPr>
+          <w:p>
+            <w:pPr>
+              <w:spacing w:after="40"/>
+            </w:pPr>
+            <w:r>
+              <w:rPr>
+                <w:sz w:val="18"/>
+              </w:rPr>
+            </w:r>
+            <w:r>
+              <w:rPr>
+                <w:b/>
+                <w:i w:val="0"/>
+                <w:sz w:val="18"/>
+              </w:rPr>
+              <w:t>Contraindicated with systolic blood pressure below 100 mmHg.</w:t>
+            </w:r>
+          </w:p>
+        </w:tc>
+        <w:tc>
+          <w:tcPr>
+            <w:tcW w:type="dxa" w:w="2556"/>
+          </w:tcPr>
+          <w:p>
+            <w:pPr>
+              <w:spacing w:after="40"/>
+            </w:pPr>
+            <w:r>
+              <w:rPr>
+                <w:sz w:val="18"/>
+              </w:rPr>
+            </w:r>
+            <w:r>
+              <w:rPr>
+                <w:b w:val="0"/>
+                <w:i w:val="0"/>
+                <w:sz w:val="18"/>
+              </w:rPr>
+              <w:t>L8</w:t>
+            </w:r>
+            <w:r>
+              <w:rPr>
+                <w:sz w:val="18"/>
+              </w:rPr>
+              <w:br/>
+            </w:r>
+            <w:r>
+              <w:rPr>
+                <w:b w:val="0"/>
+                <w:i w:val="0"/>
+                <w:sz w:val="18"/>
+              </w:rPr>
+              <w:t>slide 23</w:t>
+            </w:r>
+          </w:p>
+        </w:tc>
+      </w:tr>
+      <w:tr>
+        <w:tc>
+          <w:tcPr>
+            <w:tcW w:type="dxa" w:w="2556"/>
+          </w:tcPr>
+          <w:p>
+            <w:pPr>
+              <w:spacing w:after="40"/>
+            </w:pPr>
+            <w:r>
+              <w:rPr>
+                <w:sz w:val="18"/>
+              </w:rPr>
+            </w:r>
+            <w:r>
+              <w:rPr>
+                <w:b w:val="0"/>
+                <w:i w:val="0"/>
+                <w:sz w:val="18"/>
+              </w:rPr>
+              <w:t>Non-dihydropyridine calcium channel blockers</w:t>
+            </w:r>
+            <w:r>
+              <w:rPr>
+                <w:sz w:val="18"/>
+              </w:rPr>
+              <w:br/>
+            </w:r>
+            <w:r>
+              <w:rPr>
+                <w:b w:val="0"/>
+                <w:i w:val="0"/>
+                <w:sz w:val="18"/>
+              </w:rPr>
+              <w:t>diltiazem, verapamil</w:t>
+            </w:r>
+          </w:p>
+        </w:tc>
+        <w:tc>
+          <w:tcPr>
+            <w:tcW w:type="dxa" w:w="2556"/>
+          </w:tcPr>
+          <w:p>
+            <w:pPr>
+              <w:spacing w:after="40"/>
+            </w:pPr>
+            <w:r>
+              <w:rPr>
+                <w:sz w:val="18"/>
+              </w:rPr>
+            </w:r>
+            <w:r>
+              <w:rPr>
+                <w:b w:val="0"/>
+                <w:i w:val="0"/>
+                <w:sz w:val="18"/>
+              </w:rPr>
+              <w:t>Contraindicated</w:t>
+            </w:r>
+          </w:p>
+        </w:tc>
+        <w:tc>
+          <w:tcPr>
+            <w:tcW w:type="dxa" w:w="2556"/>
+          </w:tcPr>
+          <w:p>
+            <w:pPr>
+              <w:spacing w:after="40"/>
+            </w:pPr>
+            <w:r>
+              <w:rPr>
+                <w:sz w:val="18"/>
+              </w:rPr>
+            </w:r>
+            <w:r>
+              <w:rPr>
+                <w:b/>
+                <w:i w:val="0"/>
+                <w:sz w:val="18"/>
+              </w:rPr>
+              <w:t>Contraindicated with heart rate below 60, acute heart failure and ejection fraction below 40 percent.</w:t>
+            </w:r>
+            <w:r>
+              <w:rPr>
+                <w:b w:val="0"/>
+                <w:i w:val="0"/>
+                <w:sz w:val="18"/>
+              </w:rPr>
+              <w:t xml:space="preserve"> Atrioventricular block is also listed; it is the non-dihydropyridines that slow atrioventricular conduction.</w:t>
+            </w:r>
+          </w:p>
+        </w:tc>
+        <w:tc>
+          <w:tcPr>
+            <w:tcW w:type="dxa" w:w="2556"/>
+          </w:tcPr>
+          <w:p>
+            <w:pPr>
+              <w:spacing w:after="40"/>
+            </w:pPr>
+            <w:r>
+              <w:rPr>
+                <w:sz w:val="18"/>
+              </w:rPr>
+            </w:r>
+            <w:r>
+              <w:rPr>
+                <w:b w:val="0"/>
+                <w:i w:val="0"/>
+                <w:sz w:val="18"/>
+              </w:rPr>
+              <w:t>L8</w:t>
+            </w:r>
+            <w:r>
+              <w:rPr>
+                <w:sz w:val="18"/>
+              </w:rPr>
+              <w:br/>
+            </w:r>
+            <w:r>
+              <w:rPr>
+                <w:b w:val="0"/>
+                <w:i w:val="0"/>
+                <w:sz w:val="18"/>
+              </w:rPr>
+              <w:t>slide 23</w:t>
+            </w:r>
+          </w:p>
+        </w:tc>
+      </w:tr>
+      <w:tr>
+        <w:tc>
+          <w:tcPr>
+            <w:tcW w:type="dxa" w:w="2556"/>
+          </w:tcPr>
+          <w:p>
+            <w:pPr>
+              <w:spacing w:after="40"/>
+            </w:pPr>
+            <w:r>
+              <w:rPr>
+                <w:sz w:val="18"/>
+              </w:rPr>
+            </w:r>
+            <w:r>
+              <w:rPr>
+                <w:b w:val="0"/>
+                <w:i w:val="0"/>
+                <w:sz w:val="18"/>
+              </w:rPr>
+              <w:t>Calcium channel blockers</w:t>
+            </w:r>
+            <w:r>
+              <w:rPr>
+                <w:sz w:val="18"/>
+              </w:rPr>
+              <w:br/>
+            </w:r>
+            <w:r>
+              <w:rPr>
+                <w:b w:val="0"/>
+                <w:i w:val="0"/>
+                <w:sz w:val="18"/>
+              </w:rPr>
+              <w:t>dihydropyridine and non-dihydropyridine</w:t>
+            </w:r>
+          </w:p>
+        </w:tc>
+        <w:tc>
+          <w:tcPr>
+            <w:tcW w:type="dxa" w:w="2556"/>
+          </w:tcPr>
+          <w:p>
+            <w:pPr>
+              <w:spacing w:after="40"/>
+            </w:pPr>
+            <w:r>
+              <w:rPr>
+                <w:sz w:val="18"/>
+              </w:rPr>
+            </w:r>
+            <w:r>
+              <w:rPr>
+                <w:b w:val="0"/>
+                <w:i w:val="0"/>
+                <w:sz w:val="18"/>
+              </w:rPr>
+              <w:t>Caution</w:t>
+            </w:r>
+          </w:p>
+        </w:tc>
+        <w:tc>
+          <w:tcPr>
+            <w:tcW w:type="dxa" w:w="2556"/>
+          </w:tcPr>
+          <w:p>
+            <w:pPr>
+              <w:spacing w:after="40"/>
+            </w:pPr>
+            <w:r>
+              <w:rPr>
+                <w:sz w:val="18"/>
+              </w:rPr>
+            </w:r>
+            <w:r>
+              <w:rPr>
+                <w:b/>
+                <w:i w:val="0"/>
+                <w:sz w:val="18"/>
+              </w:rPr>
+              <w:t>Precautions: concurrent beta blocker use</w:t>
+            </w:r>
+            <w:r>
+              <w:rPr>
+                <w:b w:val="0"/>
+                <w:i w:val="0"/>
+                <w:sz w:val="18"/>
+              </w:rPr>
+              <w:t xml:space="preserve"> (non-dihydropyridines) and </w:t>
+            </w:r>
+            <w:r>
+              <w:rPr>
+                <w:b/>
+                <w:i w:val="0"/>
+                <w:sz w:val="18"/>
+              </w:rPr>
+              <w:t>cytochrome P450 3A4 (CYP3A4) interactions</w:t>
+            </w:r>
+            <w:r>
+              <w:rPr>
+                <w:b w:val="0"/>
+                <w:i w:val="0"/>
+                <w:sz w:val="18"/>
+              </w:rPr>
+              <w:t>.</w:t>
+            </w:r>
+          </w:p>
+        </w:tc>
+        <w:tc>
+          <w:tcPr>
+            <w:tcW w:type="dxa" w:w="2556"/>
+          </w:tcPr>
+          <w:p>
+            <w:pPr>
+              <w:spacing w:after="40"/>
+            </w:pPr>
+            <w:r>
+              <w:rPr>
+                <w:sz w:val="18"/>
+              </w:rPr>
+            </w:r>
+            <w:r>
+              <w:rPr>
+                <w:b w:val="0"/>
+                <w:i w:val="0"/>
+                <w:sz w:val="18"/>
+              </w:rPr>
+              <w:t>L8</w:t>
+            </w:r>
+            <w:r>
+              <w:rPr>
+                <w:sz w:val="18"/>
+              </w:rPr>
+              <w:br/>
+            </w:r>
+            <w:r>
+              <w:rPr>
+                <w:b w:val="0"/>
+                <w:i w:val="0"/>
+                <w:sz w:val="18"/>
+              </w:rPr>
+              <w:t>slide 23</w:t>
+            </w:r>
+          </w:p>
+        </w:tc>
+      </w:tr>
+      <w:tr>
+        <w:tc>
+          <w:tcPr>
+            <w:tcW w:type="dxa" w:w="2556"/>
+          </w:tcPr>
+          <w:p>
+            <w:pPr>
+              <w:spacing w:after="40"/>
+            </w:pPr>
+            <w:r>
+              <w:rPr>
+                <w:sz w:val="18"/>
+              </w:rPr>
+            </w:r>
+            <w:r>
+              <w:rPr>
+                <w:b w:val="0"/>
+                <w:i w:val="0"/>
+                <w:sz w:val="18"/>
+              </w:rPr>
+              <w:t>Dihydropyridine calcium channel blockers</w:t>
+            </w:r>
+            <w:r>
+              <w:rPr>
+                <w:sz w:val="18"/>
+              </w:rPr>
+              <w:br/>
+            </w:r>
+            <w:r>
+              <w:rPr>
+                <w:b w:val="0"/>
+                <w:i w:val="0"/>
+                <w:sz w:val="18"/>
+              </w:rPr>
+              <w:t>nifedipine, amlodipine, felodipine</w:t>
+            </w:r>
+          </w:p>
+        </w:tc>
+        <w:tc>
+          <w:tcPr>
+            <w:tcW w:type="dxa" w:w="2556"/>
+          </w:tcPr>
+          <w:p>
+            <w:pPr>
+              <w:spacing w:after="40"/>
+            </w:pPr>
+            <w:r>
+              <w:rPr>
+                <w:sz w:val="18"/>
+              </w:rPr>
+            </w:r>
+            <w:r>
+              <w:rPr>
+                <w:b w:val="0"/>
+                <w:i w:val="0"/>
+                <w:sz w:val="18"/>
+              </w:rPr>
+              <w:t>Avoid</w:t>
+            </w:r>
+          </w:p>
+        </w:tc>
+        <w:tc>
+          <w:tcPr>
+            <w:tcW w:type="dxa" w:w="2556"/>
+          </w:tcPr>
+          <w:p>
+            <w:pPr>
+              <w:spacing w:after="40"/>
+            </w:pPr>
+            <w:r>
+              <w:rPr>
+                <w:sz w:val="18"/>
+              </w:rPr>
+            </w:r>
+            <w:r>
+              <w:rPr>
+                <w:b/>
+                <w:i w:val="0"/>
+                <w:sz w:val="18"/>
+              </w:rPr>
+              <w:t>Avoid short-acting agents</w:t>
+            </w:r>
+            <w:r>
+              <w:rPr>
+                <w:b w:val="0"/>
+                <w:i w:val="0"/>
+                <w:sz w:val="18"/>
+              </w:rPr>
+              <w:t>, nifedipine being the named example.</w:t>
+            </w:r>
+          </w:p>
+        </w:tc>
+        <w:tc>
+          <w:tcPr>
+            <w:tcW w:type="dxa" w:w="2556"/>
+          </w:tcPr>
+          <w:p>
+            <w:pPr>
+              <w:spacing w:after="40"/>
+            </w:pPr>
+            <w:r>
+              <w:rPr>
+                <w:sz w:val="18"/>
+              </w:rPr>
+            </w:r>
+            <w:r>
+              <w:rPr>
+                <w:b w:val="0"/>
+                <w:i w:val="0"/>
+                <w:sz w:val="18"/>
+              </w:rPr>
+              <w:t>L8</w:t>
+            </w:r>
+            <w:r>
+              <w:rPr>
+                <w:sz w:val="18"/>
+              </w:rPr>
+              <w:br/>
+            </w:r>
+            <w:r>
+              <w:rPr>
+                <w:b w:val="0"/>
+                <w:i w:val="0"/>
+                <w:sz w:val="18"/>
+              </w:rPr>
+              <w:t>slide 22</w:t>
+            </w:r>
+          </w:p>
+        </w:tc>
+      </w:tr>
+      <w:tr>
+        <w:tc>
+          <w:tcPr>
+            <w:tcW w:type="dxa" w:w="2556"/>
+          </w:tcPr>
+          <w:p>
+            <w:pPr>
+              <w:spacing w:after="40"/>
+            </w:pPr>
+            <w:r>
+              <w:rPr>
+                <w:sz w:val="18"/>
+              </w:rPr>
+            </w:r>
+            <w:r>
+              <w:rPr>
+                <w:b w:val="0"/>
+                <w:i w:val="0"/>
+                <w:sz w:val="18"/>
+              </w:rPr>
+              <w:t>Non-dihydropyridine calcium channel blockers</w:t>
+            </w:r>
+            <w:r>
+              <w:rPr>
+                <w:sz w:val="18"/>
+              </w:rPr>
+              <w:br/>
+            </w:r>
+            <w:r>
+              <w:rPr>
+                <w:b w:val="0"/>
+                <w:i w:val="0"/>
+                <w:sz w:val="18"/>
+              </w:rPr>
+              <w:t>diltiazem, verapamil</w:t>
+            </w:r>
+          </w:p>
+        </w:tc>
+        <w:tc>
+          <w:tcPr>
+            <w:tcW w:type="dxa" w:w="2556"/>
+          </w:tcPr>
+          <w:p>
+            <w:pPr>
+              <w:spacing w:after="40"/>
+            </w:pPr>
+            <w:r>
+              <w:rPr>
+                <w:sz w:val="18"/>
+              </w:rPr>
+            </w:r>
+            <w:r>
+              <w:rPr>
+                <w:b w:val="0"/>
+                <w:i w:val="0"/>
+                <w:sz w:val="18"/>
+              </w:rPr>
+              <w:t>Avoid</w:t>
+            </w:r>
+          </w:p>
+        </w:tc>
+        <w:tc>
+          <w:tcPr>
+            <w:tcW w:type="dxa" w:w="2556"/>
+          </w:tcPr>
+          <w:p>
+            <w:pPr>
+              <w:spacing w:after="40"/>
+            </w:pPr>
+            <w:r>
+              <w:rPr>
+                <w:sz w:val="18"/>
+              </w:rPr>
+            </w:r>
+            <w:r>
+              <w:rPr>
+                <w:b/>
+                <w:i w:val="0"/>
+                <w:sz w:val="18"/>
+              </w:rPr>
+              <w:t>Avoid in bradycardia or atrioventricular block</w:t>
+            </w:r>
+            <w:r>
+              <w:rPr>
+                <w:b w:val="0"/>
+                <w:i w:val="0"/>
+                <w:sz w:val="18"/>
+              </w:rPr>
+              <w:t xml:space="preserve"> (a dihydropyridine is first line).</w:t>
+            </w:r>
+          </w:p>
+        </w:tc>
+        <w:tc>
+          <w:tcPr>
+            <w:tcW w:type="dxa" w:w="2556"/>
+          </w:tcPr>
+          <w:p>
+            <w:pPr>
+              <w:spacing w:after="40"/>
+            </w:pPr>
+            <w:r>
+              <w:rPr>
+                <w:sz w:val="18"/>
+              </w:rPr>
+            </w:r>
+            <w:r>
+              <w:rPr>
+                <w:b w:val="0"/>
+                <w:i w:val="0"/>
+                <w:sz w:val="18"/>
+              </w:rPr>
+              <w:t>L8</w:t>
+            </w:r>
+            <w:r>
+              <w:rPr>
+                <w:sz w:val="18"/>
+              </w:rPr>
+              <w:br/>
+            </w:r>
+            <w:r>
+              <w:rPr>
+                <w:b w:val="0"/>
+                <w:i w:val="0"/>
+                <w:sz w:val="18"/>
+              </w:rPr>
+              <w:t>slide 34</w:t>
+            </w:r>
+          </w:p>
+        </w:tc>
+      </w:tr>
+      <w:tr>
+        <w:tc>
+          <w:tcPr>
+            <w:tcW w:type="dxa" w:w="2556"/>
+          </w:tcPr>
+          <w:p>
+            <w:pPr>
+              <w:spacing w:after="40"/>
+            </w:pPr>
+            <w:r>
+              <w:rPr>
+                <w:sz w:val="18"/>
+              </w:rPr>
+            </w:r>
+            <w:r>
+              <w:rPr>
+                <w:b w:val="0"/>
+                <w:i w:val="0"/>
+                <w:sz w:val="18"/>
+              </w:rPr>
+              <w:t>Calcium channel blockers</w:t>
+            </w:r>
+            <w:r>
+              <w:rPr>
+                <w:sz w:val="18"/>
+              </w:rPr>
+              <w:br/>
+            </w:r>
+            <w:r>
+              <w:rPr>
+                <w:b w:val="0"/>
+                <w:i w:val="0"/>
+                <w:sz w:val="18"/>
+              </w:rPr>
+              <w:t>dihydropyridine and non-dihydropyridine</w:t>
+            </w:r>
+          </w:p>
+        </w:tc>
+        <w:tc>
+          <w:tcPr>
+            <w:tcW w:type="dxa" w:w="2556"/>
+          </w:tcPr>
+          <w:p>
+            <w:pPr>
+              <w:spacing w:after="40"/>
+            </w:pPr>
+            <w:r>
+              <w:rPr>
+                <w:sz w:val="18"/>
+              </w:rPr>
+            </w:r>
+            <w:r>
+              <w:rPr>
+                <w:b w:val="0"/>
+                <w:i w:val="0"/>
+                <w:sz w:val="18"/>
+              </w:rPr>
+              <w:t>Avoid</w:t>
+            </w:r>
+          </w:p>
+        </w:tc>
+        <w:tc>
+          <w:tcPr>
+            <w:tcW w:type="dxa" w:w="2556"/>
+          </w:tcPr>
+          <w:p>
+            <w:pPr>
+              <w:spacing w:after="40"/>
+            </w:pPr>
+            <w:r>
+              <w:rPr>
+                <w:sz w:val="18"/>
+              </w:rPr>
+            </w:r>
+            <w:r>
+              <w:rPr>
+                <w:b/>
+                <w:i w:val="0"/>
+                <w:sz w:val="18"/>
+              </w:rPr>
+              <w:t>Decreased left ventricular function:</w:t>
+            </w:r>
+            <w:r>
+              <w:rPr>
+                <w:b w:val="0"/>
+                <w:i w:val="0"/>
+                <w:sz w:val="18"/>
+              </w:rPr>
+              <w:t xml:space="preserve"> amlodipine is the calcium channel blocker alternative; </w:t>
+            </w:r>
+            <w:r>
+              <w:rPr>
+                <w:b/>
+                <w:i w:val="0"/>
+                <w:sz w:val="18"/>
+              </w:rPr>
+              <w:t>other calcium channel blockers are avoided</w:t>
+            </w:r>
+            <w:r>
+              <w:rPr>
+                <w:b w:val="0"/>
+                <w:i w:val="0"/>
+                <w:sz w:val="18"/>
+              </w:rPr>
+              <w:t>.</w:t>
+            </w:r>
+          </w:p>
+        </w:tc>
+        <w:tc>
+          <w:tcPr>
+            <w:tcW w:type="dxa" w:w="2556"/>
+          </w:tcPr>
+          <w:p>
+            <w:pPr>
+              <w:spacing w:after="40"/>
+            </w:pPr>
+            <w:r>
+              <w:rPr>
+                <w:sz w:val="18"/>
+              </w:rPr>
+            </w:r>
+            <w:r>
+              <w:rPr>
+                <w:b w:val="0"/>
+                <w:i w:val="0"/>
+                <w:sz w:val="18"/>
+              </w:rPr>
+              <w:t>L8</w:t>
+            </w:r>
+            <w:r>
+              <w:rPr>
+                <w:sz w:val="18"/>
+              </w:rPr>
+              <w:br/>
+            </w:r>
+            <w:r>
+              <w:rPr>
+                <w:b w:val="0"/>
+                <w:i w:val="0"/>
+                <w:sz w:val="18"/>
+              </w:rPr>
+              <w:t>slide 34</w:t>
+            </w:r>
+          </w:p>
+        </w:tc>
+      </w:tr>
+      <w:tr>
+        <w:tc>
+          <w:tcPr>
+            <w:tcW w:type="dxa" w:w="10224"/>
+            <w:gridSpan w:val="4"/>
+          </w:tcPr>
+          <w:p>
+            <w:pPr>
+              <w:spacing w:after="40"/>
+            </w:pPr>
+            <w:r/>
+          </w:p>
+        </w:tc>
+      </w:tr>
+      <w:tr>
+        <w:tc>
+          <w:tcPr>
+            <w:tcW w:type="dxa" w:w="2556"/>
+          </w:tcPr>
+          <w:p>
+            <w:pPr>
+              <w:spacing w:after="40"/>
+            </w:pPr>
+            <w:r>
+              <w:rPr>
+                <w:sz w:val="18"/>
+              </w:rPr>
+            </w:r>
+            <w:r>
+              <w:rPr>
+                <w:b w:val="0"/>
+                <w:i w:val="0"/>
+                <w:sz w:val="18"/>
+              </w:rPr>
+              <w:t>Nitrates</w:t>
+            </w:r>
+            <w:r>
+              <w:rPr>
+                <w:sz w:val="18"/>
+              </w:rPr>
+              <w:br/>
+            </w:r>
+            <w:r>
+              <w:rPr>
+                <w:b w:val="0"/>
+                <w:i w:val="0"/>
+                <w:sz w:val="18"/>
+              </w:rPr>
+              <w:t>nitroglycerin, isosorbide</w:t>
+            </w:r>
+          </w:p>
+        </w:tc>
+        <w:tc>
+          <w:tcPr>
+            <w:tcW w:type="dxa" w:w="2556"/>
+          </w:tcPr>
+          <w:p>
+            <w:pPr>
+              <w:spacing w:after="40"/>
+            </w:pPr>
+            <w:r>
+              <w:rPr>
+                <w:sz w:val="18"/>
+              </w:rPr>
+            </w:r>
+            <w:r>
+              <w:rPr>
+                <w:b w:val="0"/>
+                <w:i w:val="0"/>
+                <w:sz w:val="18"/>
+              </w:rPr>
+              <w:t>Avoid</w:t>
+            </w:r>
+          </w:p>
+        </w:tc>
+        <w:tc>
+          <w:tcPr>
+            <w:tcW w:type="dxa" w:w="2556"/>
+          </w:tcPr>
+          <w:p>
+            <w:pPr>
+              <w:spacing w:after="40"/>
+            </w:pPr>
+            <w:r>
+              <w:rPr>
+                <w:sz w:val="18"/>
+              </w:rPr>
+            </w:r>
+            <w:r>
+              <w:rPr>
+                <w:b/>
+                <w:i w:val="0"/>
+                <w:sz w:val="18"/>
+              </w:rPr>
+              <w:t>Avoid in severe aortic valve stenosis and obstructive cardiomyopathy</w:t>
+            </w:r>
+            <w:r>
+              <w:rPr>
+                <w:b w:val="0"/>
+                <w:i w:val="0"/>
+                <w:sz w:val="18"/>
+              </w:rPr>
+              <w:t xml:space="preserve"> (older lists call these contraindications; the risk is hypotension).</w:t>
+            </w:r>
+          </w:p>
+        </w:tc>
+        <w:tc>
+          <w:tcPr>
+            <w:tcW w:type="dxa" w:w="2556"/>
+          </w:tcPr>
+          <w:p>
+            <w:pPr>
+              <w:spacing w:after="40"/>
+            </w:pPr>
+            <w:r>
+              <w:rPr>
+                <w:sz w:val="18"/>
+              </w:rPr>
+            </w:r>
+            <w:r>
+              <w:rPr>
+                <w:b w:val="0"/>
+                <w:i w:val="0"/>
+                <w:sz w:val="18"/>
+              </w:rPr>
+              <w:t>L8</w:t>
+            </w:r>
+            <w:r>
+              <w:rPr>
+                <w:sz w:val="18"/>
+              </w:rPr>
+              <w:br/>
+            </w:r>
+            <w:r>
+              <w:rPr>
+                <w:b w:val="0"/>
+                <w:i w:val="0"/>
+                <w:sz w:val="18"/>
+              </w:rPr>
+              <w:t>slide 33</w:t>
+            </w:r>
+          </w:p>
+        </w:tc>
+      </w:tr>
+      <w:tr>
+        <w:tc>
+          <w:tcPr>
+            <w:tcW w:type="dxa" w:w="2556"/>
+          </w:tcPr>
+          <w:p>
+            <w:pPr>
+              <w:spacing w:after="40"/>
+            </w:pPr>
+            <w:r>
+              <w:rPr>
+                <w:sz w:val="18"/>
+              </w:rPr>
+            </w:r>
+            <w:r>
+              <w:rPr>
+                <w:b w:val="0"/>
+                <w:i w:val="0"/>
+                <w:sz w:val="18"/>
+              </w:rPr>
+              <w:t>Nitrates</w:t>
+            </w:r>
+            <w:r>
+              <w:rPr>
+                <w:sz w:val="18"/>
+              </w:rPr>
+              <w:br/>
+            </w:r>
+            <w:r>
+              <w:rPr>
+                <w:b w:val="0"/>
+                <w:i w:val="0"/>
+                <w:sz w:val="18"/>
+              </w:rPr>
+              <w:t>nitroglycerin, isosorbide</w:t>
+            </w:r>
+          </w:p>
+        </w:tc>
+        <w:tc>
+          <w:tcPr>
+            <w:tcW w:type="dxa" w:w="2556"/>
+          </w:tcPr>
+          <w:p>
+            <w:pPr>
+              <w:spacing w:after="40"/>
+            </w:pPr>
+            <w:r>
+              <w:rPr>
+                <w:sz w:val="18"/>
+              </w:rPr>
+            </w:r>
+            <w:r>
+              <w:rPr>
+                <w:b w:val="0"/>
+                <w:i w:val="0"/>
+                <w:sz w:val="18"/>
+              </w:rPr>
+              <w:t>Contraindicated</w:t>
+            </w:r>
+          </w:p>
+        </w:tc>
+        <w:tc>
+          <w:tcPr>
+            <w:tcW w:type="dxa" w:w="2556"/>
+          </w:tcPr>
+          <w:p>
+            <w:pPr>
+              <w:spacing w:after="40"/>
+            </w:pPr>
+            <w:r>
+              <w:rPr>
+                <w:sz w:val="18"/>
+              </w:rPr>
+            </w:r>
+            <w:r>
+              <w:rPr>
+                <w:b/>
+                <w:i w:val="0"/>
+                <w:sz w:val="18"/>
+              </w:rPr>
+              <w:t>Contraindicated with phosphodiesterase type 5 inhibitors</w:t>
+            </w:r>
+            <w:r>
+              <w:rPr>
+                <w:b w:val="0"/>
+                <w:i w:val="0"/>
+                <w:sz w:val="18"/>
+              </w:rPr>
+              <w:t xml:space="preserve"> (sildenafil, tadalafil, vardenafil): concurrent use may lead to hypotension, myocardial infarction or stroke.</w:t>
+            </w:r>
+          </w:p>
+        </w:tc>
+        <w:tc>
+          <w:tcPr>
+            <w:tcW w:type="dxa" w:w="2556"/>
+          </w:tcPr>
+          <w:p>
+            <w:pPr>
+              <w:spacing w:after="40"/>
+            </w:pPr>
+            <w:r>
+              <w:rPr>
+                <w:sz w:val="18"/>
+              </w:rPr>
+            </w:r>
+            <w:r>
+              <w:rPr>
+                <w:b w:val="0"/>
+                <w:i w:val="0"/>
+                <w:sz w:val="18"/>
+              </w:rPr>
+              <w:t>L8</w:t>
+            </w:r>
+            <w:r>
+              <w:rPr>
+                <w:sz w:val="18"/>
+              </w:rPr>
+              <w:br/>
+            </w:r>
+            <w:r>
+              <w:rPr>
+                <w:b w:val="0"/>
+                <w:i w:val="0"/>
+                <w:sz w:val="18"/>
+              </w:rPr>
+              <w:t>slide 33</w:t>
+            </w:r>
+          </w:p>
+        </w:tc>
+      </w:tr>
+      <w:tr>
+        <w:tc>
+          <w:tcPr>
+            <w:tcW w:type="dxa" w:w="2556"/>
+          </w:tcPr>
+          <w:p>
+            <w:pPr>
+              <w:spacing w:after="40"/>
+            </w:pPr>
+            <w:r>
+              <w:rPr>
+                <w:sz w:val="18"/>
+              </w:rPr>
+            </w:r>
+            <w:r>
+              <w:rPr>
+                <w:b w:val="0"/>
+                <w:i w:val="0"/>
+                <w:sz w:val="18"/>
+              </w:rPr>
+              <w:t>Nitrates in acute coronary syndrome</w:t>
+            </w:r>
+          </w:p>
+        </w:tc>
+        <w:tc>
+          <w:tcPr>
+            <w:tcW w:type="dxa" w:w="2556"/>
+          </w:tcPr>
+          <w:p>
+            <w:pPr>
+              <w:spacing w:after="40"/>
+            </w:pPr>
+            <w:r>
+              <w:rPr>
+                <w:sz w:val="18"/>
+              </w:rPr>
+            </w:r>
+            <w:r>
+              <w:rPr>
+                <w:b w:val="0"/>
+                <w:i w:val="0"/>
+                <w:sz w:val="18"/>
+              </w:rPr>
+              <w:t>Contraindicated</w:t>
+            </w:r>
+          </w:p>
+        </w:tc>
+        <w:tc>
+          <w:tcPr>
+            <w:tcW w:type="dxa" w:w="2556"/>
+          </w:tcPr>
+          <w:p>
+            <w:pPr>
+              <w:spacing w:after="40"/>
+            </w:pPr>
+            <w:r>
+              <w:rPr>
+                <w:sz w:val="18"/>
+              </w:rPr>
+            </w:r>
+            <w:r>
+              <w:rPr>
+                <w:b/>
+                <w:i w:val="0"/>
+                <w:sz w:val="18"/>
+              </w:rPr>
+              <w:t>Contraindicated with hypotension and with phosphodiesterase inhibitors.</w:t>
+            </w:r>
+            <w:r>
+              <w:rPr>
+                <w:b w:val="0"/>
+                <w:i w:val="0"/>
+                <w:sz w:val="18"/>
+              </w:rPr>
+              <w:t xml:space="preserve"> No mortality benefit, only pain relief.</w:t>
+            </w:r>
+          </w:p>
+        </w:tc>
+        <w:tc>
+          <w:tcPr>
+            <w:tcW w:type="dxa" w:w="2556"/>
+          </w:tcPr>
+          <w:p>
+            <w:pPr>
+              <w:spacing w:after="40"/>
+            </w:pPr>
+            <w:r>
+              <w:rPr>
+                <w:sz w:val="18"/>
+              </w:rPr>
+            </w:r>
+            <w:r>
+              <w:rPr>
+                <w:b w:val="0"/>
+                <w:i w:val="0"/>
+                <w:sz w:val="18"/>
+              </w:rPr>
+              <w:t>L8</w:t>
+            </w:r>
+            <w:r>
+              <w:rPr>
+                <w:sz w:val="18"/>
+              </w:rPr>
+              <w:br/>
+            </w:r>
+            <w:r>
+              <w:rPr>
+                <w:b w:val="0"/>
+                <w:i w:val="0"/>
+                <w:sz w:val="18"/>
+              </w:rPr>
+              <w:t>slide 54</w:t>
+            </w:r>
+          </w:p>
+        </w:tc>
+      </w:tr>
+      <w:tr>
+        <w:tc>
+          <w:tcPr>
+            <w:tcW w:type="dxa" w:w="10224"/>
+            <w:gridSpan w:val="4"/>
+          </w:tcPr>
+          <w:p>
+            <w:pPr>
+              <w:spacing w:after="40"/>
+            </w:pPr>
+            <w:r/>
+          </w:p>
+        </w:tc>
+      </w:tr>
+      <w:tr>
+        <w:tc>
+          <w:tcPr>
+            <w:tcW w:type="dxa" w:w="2556"/>
+          </w:tcPr>
+          <w:p>
+            <w:pPr>
+              <w:spacing w:after="40"/>
+            </w:pPr>
+            <w:r>
+              <w:rPr>
+                <w:sz w:val="18"/>
+              </w:rPr>
+            </w:r>
+            <w:r>
+              <w:rPr>
+                <w:b w:val="0"/>
+                <w:i w:val="0"/>
+                <w:sz w:val="18"/>
+              </w:rPr>
+              <w:t>Aspirin in acute coronary syndrome</w:t>
+            </w:r>
+          </w:p>
+        </w:tc>
+        <w:tc>
+          <w:tcPr>
+            <w:tcW w:type="dxa" w:w="2556"/>
+          </w:tcPr>
+          <w:p>
+            <w:pPr>
+              <w:spacing w:after="40"/>
+            </w:pPr>
+            <w:r>
+              <w:rPr>
+                <w:sz w:val="18"/>
+              </w:rPr>
+            </w:r>
+            <w:r>
+              <w:rPr>
+                <w:b w:val="0"/>
+                <w:i w:val="0"/>
+                <w:sz w:val="18"/>
+              </w:rPr>
+              <w:t>Contraindicated</w:t>
+            </w:r>
+          </w:p>
+        </w:tc>
+        <w:tc>
+          <w:tcPr>
+            <w:tcW w:type="dxa" w:w="2556"/>
+          </w:tcPr>
+          <w:p>
+            <w:pPr>
+              <w:spacing w:after="40"/>
+            </w:pPr>
+            <w:r>
+              <w:rPr>
+                <w:sz w:val="18"/>
+              </w:rPr>
+            </w:r>
+            <w:r>
+              <w:rPr>
+                <w:b/>
+                <w:i w:val="0"/>
+                <w:sz w:val="18"/>
+              </w:rPr>
+              <w:t>Contraindications: allergy, recent gastrointestinal bleeding, recent intracranial hemorrhage.</w:t>
+            </w:r>
+            <w:r>
+              <w:rPr>
+                <w:b w:val="0"/>
+                <w:i w:val="0"/>
+                <w:sz w:val="18"/>
+              </w:rPr>
+              <w:t xml:space="preserve"> (Clopidogrel is the alternative for aspirin allergy in stable disease.)</w:t>
+            </w:r>
+          </w:p>
+        </w:tc>
+        <w:tc>
+          <w:tcPr>
+            <w:tcW w:type="dxa" w:w="2556"/>
+          </w:tcPr>
+          <w:p>
+            <w:pPr>
+              <w:spacing w:after="40"/>
+            </w:pPr>
+            <w:r>
+              <w:rPr>
+                <w:sz w:val="18"/>
+              </w:rPr>
+            </w:r>
+            <w:r>
+              <w:rPr>
+                <w:b w:val="0"/>
+                <w:i w:val="0"/>
+                <w:sz w:val="18"/>
+              </w:rPr>
+              <w:t>L8</w:t>
+            </w:r>
+            <w:r>
+              <w:rPr>
+                <w:sz w:val="18"/>
+              </w:rPr>
+              <w:br/>
+            </w:r>
+            <w:r>
+              <w:rPr>
+                <w:b w:val="0"/>
+                <w:i w:val="0"/>
+                <w:sz w:val="18"/>
+              </w:rPr>
+              <w:t>slide 53</w:t>
+            </w:r>
+          </w:p>
+        </w:tc>
+      </w:tr>
+      <w:tr>
+        <w:tc>
+          <w:tcPr>
+            <w:tcW w:type="dxa" w:w="10224"/>
+            <w:gridSpan w:val="4"/>
+          </w:tcPr>
+          <w:p>
+            <w:pPr>
+              <w:spacing w:after="40"/>
+            </w:pPr>
+            <w:r/>
+          </w:p>
+        </w:tc>
+      </w:tr>
+      <w:tr>
+        <w:tc>
+          <w:tcPr>
+            <w:tcW w:type="dxa" w:w="2556"/>
+          </w:tcPr>
+          <w:p>
+            <w:pPr>
+              <w:spacing w:after="40"/>
+            </w:pPr>
+            <w:r>
+              <w:rPr>
+                <w:sz w:val="18"/>
+              </w:rPr>
+            </w:r>
+            <w:r>
+              <w:rPr>
+                <w:b w:val="0"/>
+                <w:i w:val="0"/>
+                <w:sz w:val="18"/>
+              </w:rPr>
+              <w:t>Fibrinolytics</w:t>
+            </w:r>
+            <w:r>
+              <w:rPr>
+                <w:sz w:val="18"/>
+              </w:rPr>
+              <w:br/>
+            </w:r>
+            <w:r>
+              <w:rPr>
+                <w:b w:val="0"/>
+                <w:i w:val="0"/>
+                <w:sz w:val="18"/>
+              </w:rPr>
+              <w:t>streptokinase; alteplase (Activase), reteplase (Retavase), tenecteplase (TNKase)</w:t>
+            </w:r>
+          </w:p>
+        </w:tc>
+        <w:tc>
+          <w:tcPr>
+            <w:tcW w:type="dxa" w:w="2556"/>
+          </w:tcPr>
+          <w:p>
+            <w:pPr>
+              <w:spacing w:after="40"/>
+            </w:pPr>
+            <w:r>
+              <w:rPr>
+                <w:sz w:val="18"/>
+              </w:rPr>
+            </w:r>
+            <w:r>
+              <w:rPr>
+                <w:b w:val="0"/>
+                <w:i w:val="0"/>
+                <w:sz w:val="18"/>
+              </w:rPr>
+              <w:t>Contraindicated</w:t>
+            </w:r>
+          </w:p>
+        </w:tc>
+        <w:tc>
+          <w:tcPr>
+            <w:tcW w:type="dxa" w:w="2556"/>
+          </w:tcPr>
+          <w:p>
+            <w:pPr>
+              <w:spacing w:after="40"/>
+            </w:pPr>
+            <w:r>
+              <w:rPr>
+                <w:sz w:val="18"/>
+              </w:rPr>
+            </w:r>
+            <w:r>
+              <w:rPr>
+                <w:b/>
+                <w:i w:val="0"/>
+                <w:sz w:val="18"/>
+              </w:rPr>
+              <w:t>Active bleeding or a hemorrhagic disorder.</w:t>
+            </w:r>
+          </w:p>
+        </w:tc>
+        <w:tc>
+          <w:tcPr>
+            <w:tcW w:type="dxa" w:w="2556"/>
+          </w:tcPr>
+          <w:p>
+            <w:pPr>
+              <w:spacing w:after="40"/>
+            </w:pPr>
+            <w:r>
+              <w:rPr>
+                <w:sz w:val="18"/>
+              </w:rPr>
+            </w:r>
+            <w:r>
+              <w:rPr>
+                <w:b w:val="0"/>
+                <w:i w:val="0"/>
+                <w:sz w:val="18"/>
+              </w:rPr>
+              <w:t>L8</w:t>
+            </w:r>
+            <w:r>
+              <w:rPr>
+                <w:sz w:val="18"/>
+              </w:rPr>
+              <w:br/>
+            </w:r>
+            <w:r>
+              <w:rPr>
+                <w:b w:val="0"/>
+                <w:i w:val="0"/>
+                <w:sz w:val="18"/>
+              </w:rPr>
+              <w:t>slide 63</w:t>
+            </w:r>
+          </w:p>
+        </w:tc>
+      </w:tr>
+      <w:tr>
+        <w:tc>
+          <w:tcPr>
+            <w:tcW w:type="dxa" w:w="2556"/>
+          </w:tcPr>
+          <w:p>
+            <w:pPr>
+              <w:spacing w:after="40"/>
+            </w:pPr>
+            <w:r>
+              <w:rPr>
+                <w:sz w:val="18"/>
+              </w:rPr>
+            </w:r>
+            <w:r>
+              <w:rPr>
+                <w:b w:val="0"/>
+                <w:i w:val="0"/>
+                <w:sz w:val="18"/>
+              </w:rPr>
+              <w:t>Fibrinolytics</w:t>
+            </w:r>
+            <w:r>
+              <w:rPr>
+                <w:sz w:val="18"/>
+              </w:rPr>
+              <w:br/>
+            </w:r>
+            <w:r>
+              <w:rPr>
+                <w:b w:val="0"/>
+                <w:i w:val="0"/>
+                <w:sz w:val="18"/>
+              </w:rPr>
+              <w:t>streptokinase; alteplase (Activase), reteplase (Retavase), tenecteplase (TNKase)</w:t>
+            </w:r>
+          </w:p>
+        </w:tc>
+        <w:tc>
+          <w:tcPr>
+            <w:tcW w:type="dxa" w:w="2556"/>
+          </w:tcPr>
+          <w:p>
+            <w:pPr>
+              <w:spacing w:after="40"/>
+            </w:pPr>
+            <w:r>
+              <w:rPr>
+                <w:sz w:val="18"/>
+              </w:rPr>
+            </w:r>
+            <w:r>
+              <w:rPr>
+                <w:b w:val="0"/>
+                <w:i w:val="0"/>
+                <w:sz w:val="18"/>
+              </w:rPr>
+              <w:t>Caution</w:t>
+            </w:r>
+          </w:p>
+        </w:tc>
+        <w:tc>
+          <w:tcPr>
+            <w:tcW w:type="dxa" w:w="2556"/>
+          </w:tcPr>
+          <w:p>
+            <w:pPr>
+              <w:spacing w:after="40"/>
+            </w:pPr>
+            <w:r>
+              <w:rPr>
+                <w:sz w:val="18"/>
+              </w:rPr>
+            </w:r>
+            <w:r>
+              <w:rPr>
+                <w:b/>
+                <w:i w:val="0"/>
+                <w:sz w:val="18"/>
+              </w:rPr>
+              <w:t>Recent surgery, procedures and bleeding:</w:t>
+            </w:r>
+            <w:r>
+              <w:rPr>
+                <w:b w:val="0"/>
+                <w:i w:val="0"/>
+                <w:sz w:val="18"/>
+              </w:rPr>
+              <w:t xml:space="preserve"> surgery within 10 days (including organ biopsy, puncture of non-compressible vessels and cardiopulmonary resuscitation); serious gastrointestinal bleeding within 3 months. These are older cut-offs: current guidelines treat recent major surgery, prolonged resuscitation, non-compressible punctures and recent internal bleeding as </w:t>
+            </w:r>
+            <w:r>
+              <w:rPr>
+                <w:b/>
+                <w:i w:val="0"/>
+                <w:sz w:val="18"/>
+              </w:rPr>
+              <w:t>relative</w:t>
+            </w:r>
+            <w:r>
+              <w:rPr>
+                <w:b w:val="0"/>
+                <w:i w:val="0"/>
+                <w:sz w:val="18"/>
+              </w:rPr>
+              <w:t xml:space="preserve"> contraindications with different time limits.</w:t>
+            </w:r>
+          </w:p>
+        </w:tc>
+        <w:tc>
+          <w:tcPr>
+            <w:tcW w:type="dxa" w:w="2556"/>
+          </w:tcPr>
+          <w:p>
+            <w:pPr>
+              <w:spacing w:after="40"/>
+            </w:pPr>
+            <w:r>
+              <w:rPr>
+                <w:sz w:val="18"/>
+              </w:rPr>
+            </w:r>
+            <w:r>
+              <w:rPr>
+                <w:b w:val="0"/>
+                <w:i w:val="0"/>
+                <w:sz w:val="18"/>
+              </w:rPr>
+              <w:t>L8</w:t>
+            </w:r>
+            <w:r>
+              <w:rPr>
+                <w:sz w:val="18"/>
+              </w:rPr>
+              <w:br/>
+            </w:r>
+            <w:r>
+              <w:rPr>
+                <w:b w:val="0"/>
+                <w:i w:val="0"/>
+                <w:sz w:val="18"/>
+              </w:rPr>
+              <w:t>slide 63</w:t>
+            </w:r>
+          </w:p>
+        </w:tc>
+      </w:tr>
+      <w:tr>
+        <w:tc>
+          <w:tcPr>
+            <w:tcW w:type="dxa" w:w="2556"/>
+          </w:tcPr>
+          <w:p>
+            <w:pPr>
+              <w:spacing w:after="40"/>
+            </w:pPr>
+            <w:r>
+              <w:rPr>
+                <w:sz w:val="18"/>
+              </w:rPr>
+            </w:r>
+            <w:r>
+              <w:rPr>
+                <w:b w:val="0"/>
+                <w:i w:val="0"/>
+                <w:sz w:val="18"/>
+              </w:rPr>
+              <w:t>Fibrinolytics</w:t>
+            </w:r>
+            <w:r>
+              <w:rPr>
+                <w:sz w:val="18"/>
+              </w:rPr>
+              <w:br/>
+            </w:r>
+            <w:r>
+              <w:rPr>
+                <w:b w:val="0"/>
+                <w:i w:val="0"/>
+                <w:sz w:val="18"/>
+              </w:rPr>
+              <w:t>streptokinase; alteplase (Activase), reteplase (Retavase), tenecteplase (TNKase)</w:t>
+            </w:r>
+          </w:p>
+        </w:tc>
+        <w:tc>
+          <w:tcPr>
+            <w:tcW w:type="dxa" w:w="2556"/>
+          </w:tcPr>
+          <w:p>
+            <w:pPr>
+              <w:spacing w:after="40"/>
+            </w:pPr>
+            <w:r>
+              <w:rPr>
+                <w:sz w:val="18"/>
+              </w:rPr>
+            </w:r>
+            <w:r>
+              <w:rPr>
+                <w:b w:val="0"/>
+                <w:i w:val="0"/>
+                <w:sz w:val="18"/>
+              </w:rPr>
+              <w:t>Contraindicated</w:t>
+            </w:r>
+          </w:p>
+        </w:tc>
+        <w:tc>
+          <w:tcPr>
+            <w:tcW w:type="dxa" w:w="2556"/>
+          </w:tcPr>
+          <w:p>
+            <w:pPr>
+              <w:spacing w:after="40"/>
+            </w:pPr>
+            <w:r>
+              <w:rPr>
+                <w:sz w:val="18"/>
+              </w:rPr>
+            </w:r>
+            <w:r>
+              <w:rPr>
+                <w:b/>
+                <w:i w:val="0"/>
+                <w:sz w:val="18"/>
+              </w:rPr>
+              <w:t>Serious head or facial trauma</w:t>
+            </w:r>
+            <w:r>
+              <w:rPr>
+                <w:b w:val="0"/>
+                <w:i w:val="0"/>
+                <w:sz w:val="18"/>
+              </w:rPr>
+              <w:t xml:space="preserve"> (current guidelines: significant head or facial trauma within 3 months is absolute).</w:t>
+            </w:r>
+          </w:p>
+        </w:tc>
+        <w:tc>
+          <w:tcPr>
+            <w:tcW w:type="dxa" w:w="2556"/>
+          </w:tcPr>
+          <w:p>
+            <w:pPr>
+              <w:spacing w:after="40"/>
+            </w:pPr>
+            <w:r>
+              <w:rPr>
+                <w:sz w:val="18"/>
+              </w:rPr>
+            </w:r>
+            <w:r>
+              <w:rPr>
+                <w:b w:val="0"/>
+                <w:i w:val="0"/>
+                <w:sz w:val="18"/>
+              </w:rPr>
+              <w:t>L8</w:t>
+            </w:r>
+            <w:r>
+              <w:rPr>
+                <w:sz w:val="18"/>
+              </w:rPr>
+              <w:br/>
+            </w:r>
+            <w:r>
+              <w:rPr>
+                <w:b w:val="0"/>
+                <w:i w:val="0"/>
+                <w:sz w:val="18"/>
+              </w:rPr>
+              <w:t>slide 63</w:t>
+            </w:r>
+          </w:p>
+        </w:tc>
+      </w:tr>
+      <w:tr>
+        <w:tc>
+          <w:tcPr>
+            <w:tcW w:type="dxa" w:w="2556"/>
+          </w:tcPr>
+          <w:p>
+            <w:pPr>
+              <w:spacing w:after="40"/>
+            </w:pPr>
+            <w:r>
+              <w:rPr>
+                <w:sz w:val="18"/>
+              </w:rPr>
+            </w:r>
+            <w:r>
+              <w:rPr>
+                <w:b w:val="0"/>
+                <w:i w:val="0"/>
+                <w:sz w:val="18"/>
+              </w:rPr>
+              <w:t>Fibrinolytics</w:t>
+            </w:r>
+            <w:r>
+              <w:rPr>
+                <w:sz w:val="18"/>
+              </w:rPr>
+              <w:br/>
+            </w:r>
+            <w:r>
+              <w:rPr>
+                <w:b w:val="0"/>
+                <w:i w:val="0"/>
+                <w:sz w:val="18"/>
+              </w:rPr>
+              <w:t>streptokinase; alteplase (Activase), reteplase (Retavase), tenecteplase (TNKase)</w:t>
+            </w:r>
+          </w:p>
+        </w:tc>
+        <w:tc>
+          <w:tcPr>
+            <w:tcW w:type="dxa" w:w="2556"/>
+          </w:tcPr>
+          <w:p>
+            <w:pPr>
+              <w:spacing w:after="40"/>
+            </w:pPr>
+            <w:r>
+              <w:rPr>
+                <w:sz w:val="18"/>
+              </w:rPr>
+            </w:r>
+            <w:r>
+              <w:rPr>
+                <w:b w:val="0"/>
+                <w:i w:val="0"/>
+                <w:sz w:val="18"/>
+              </w:rPr>
+              <w:t>Contraindicated</w:t>
+            </w:r>
+          </w:p>
+        </w:tc>
+        <w:tc>
+          <w:tcPr>
+            <w:tcW w:type="dxa" w:w="2556"/>
+          </w:tcPr>
+          <w:p>
+            <w:pPr>
+              <w:spacing w:after="40"/>
+            </w:pPr>
+            <w:r>
+              <w:rPr>
+                <w:sz w:val="18"/>
+              </w:rPr>
+            </w:r>
+            <w:r>
+              <w:rPr>
+                <w:b/>
+                <w:i w:val="0"/>
+                <w:sz w:val="18"/>
+              </w:rPr>
+              <w:t>Brain, aorta and pericardium:</w:t>
+            </w:r>
+            <w:r>
+              <w:rPr>
+                <w:b w:val="0"/>
+                <w:i w:val="0"/>
+                <w:sz w:val="18"/>
+              </w:rPr>
+              <w:t xml:space="preserve"> previous cerebrovascular accident or an active intracranial process (tumors); </w:t>
+            </w:r>
+            <w:r>
+              <w:rPr>
+                <w:b/>
+                <w:i w:val="0"/>
+                <w:sz w:val="18"/>
+              </w:rPr>
+              <w:t>aortic dissection</w:t>
+            </w:r>
+            <w:r>
+              <w:rPr>
+                <w:b w:val="0"/>
+                <w:i w:val="0"/>
+                <w:sz w:val="18"/>
+              </w:rPr>
+              <w:t>; acute pericarditis. Current guidelines are more specific: any prior intracranial hemorrhage, ischemic stroke within 3 months and intracranial tumors are absolute; an older ischemic stroke is only relative, and acute pericarditis is an older-list item.</w:t>
+            </w:r>
+          </w:p>
+        </w:tc>
+        <w:tc>
+          <w:tcPr>
+            <w:tcW w:type="dxa" w:w="2556"/>
+          </w:tcPr>
+          <w:p>
+            <w:pPr>
+              <w:spacing w:after="40"/>
+            </w:pPr>
+            <w:r>
+              <w:rPr>
+                <w:sz w:val="18"/>
+              </w:rPr>
+            </w:r>
+            <w:r>
+              <w:rPr>
+                <w:b w:val="0"/>
+                <w:i w:val="0"/>
+                <w:sz w:val="18"/>
+              </w:rPr>
+              <w:t>L8</w:t>
+            </w:r>
+            <w:r>
+              <w:rPr>
+                <w:sz w:val="18"/>
+              </w:rPr>
+              <w:br/>
+            </w:r>
+            <w:r>
+              <w:rPr>
+                <w:b w:val="0"/>
+                <w:i w:val="0"/>
+                <w:sz w:val="18"/>
+              </w:rPr>
+              <w:t>slide 63</w:t>
+            </w:r>
+          </w:p>
+        </w:tc>
+      </w:tr>
+      <w:tr>
+        <w:tc>
+          <w:tcPr>
+            <w:tcW w:type="dxa" w:w="2556"/>
+          </w:tcPr>
+          <w:p>
+            <w:pPr>
+              <w:spacing w:after="40"/>
+            </w:pPr>
+            <w:r>
+              <w:rPr>
+                <w:sz w:val="18"/>
+              </w:rPr>
+            </w:r>
+            <w:r>
+              <w:rPr>
+                <w:b w:val="0"/>
+                <w:i w:val="0"/>
+                <w:sz w:val="18"/>
+              </w:rPr>
+              <w:t>Fibrinolytics</w:t>
+            </w:r>
+            <w:r>
+              <w:rPr>
+                <w:sz w:val="18"/>
+              </w:rPr>
+              <w:br/>
+            </w:r>
+            <w:r>
+              <w:rPr>
+                <w:b w:val="0"/>
+                <w:i w:val="0"/>
+                <w:sz w:val="18"/>
+              </w:rPr>
+              <w:t>streptokinase; alteplase (Activase), reteplase (Retavase), tenecteplase (TNKase)</w:t>
+            </w:r>
+          </w:p>
+        </w:tc>
+        <w:tc>
+          <w:tcPr>
+            <w:tcW w:type="dxa" w:w="2556"/>
+          </w:tcPr>
+          <w:p>
+            <w:pPr>
+              <w:spacing w:after="40"/>
+            </w:pPr>
+            <w:r>
+              <w:rPr>
+                <w:sz w:val="18"/>
+              </w:rPr>
+            </w:r>
+            <w:r>
+              <w:rPr>
+                <w:b w:val="0"/>
+                <w:i w:val="0"/>
+                <w:sz w:val="18"/>
+              </w:rPr>
+              <w:t>Caution</w:t>
+            </w:r>
+          </w:p>
+        </w:tc>
+        <w:tc>
+          <w:tcPr>
+            <w:tcW w:type="dxa" w:w="2556"/>
+          </w:tcPr>
+          <w:p>
+            <w:pPr>
+              <w:spacing w:after="40"/>
+            </w:pPr>
+            <w:r>
+              <w:rPr>
+                <w:sz w:val="18"/>
+              </w:rPr>
+            </w:r>
+            <w:r>
+              <w:rPr>
+                <w:b/>
+                <w:i w:val="0"/>
+                <w:sz w:val="18"/>
+              </w:rPr>
+              <w:t>Severe uncontrolled hypertension</w:t>
+            </w:r>
+            <w:r>
+              <w:rPr>
+                <w:b w:val="0"/>
+                <w:i w:val="0"/>
+                <w:sz w:val="18"/>
+              </w:rPr>
+              <w:t xml:space="preserve"> (diastolic pressure above 110 mmHg). A history of hypertension alone is not a contraindication.</w:t>
+            </w:r>
+          </w:p>
+        </w:tc>
+        <w:tc>
+          <w:tcPr>
+            <w:tcW w:type="dxa" w:w="2556"/>
+          </w:tcPr>
+          <w:p>
+            <w:pPr>
+              <w:spacing w:after="40"/>
+            </w:pPr>
+            <w:r>
+              <w:rPr>
+                <w:sz w:val="18"/>
+              </w:rPr>
+            </w:r>
+            <w:r>
+              <w:rPr>
+                <w:b w:val="0"/>
+                <w:i w:val="0"/>
+                <w:sz w:val="18"/>
+              </w:rPr>
+              <w:t>L8</w:t>
+            </w:r>
+            <w:r>
+              <w:rPr>
+                <w:sz w:val="18"/>
+              </w:rPr>
+              <w:br/>
+            </w:r>
+            <w:r>
+              <w:rPr>
+                <w:b w:val="0"/>
+                <w:i w:val="0"/>
+                <w:sz w:val="18"/>
+              </w:rPr>
+              <w:t>slide 63</w:t>
+            </w:r>
+          </w:p>
+        </w:tc>
+      </w:tr>
+      <w:tr>
+        <w:tc>
+          <w:tcPr>
+            <w:tcW w:type="dxa" w:w="2556"/>
+          </w:tcPr>
+          <w:p>
+            <w:pPr>
+              <w:spacing w:after="40"/>
+            </w:pPr>
+            <w:r>
+              <w:rPr>
+                <w:sz w:val="18"/>
+              </w:rPr>
+            </w:r>
+            <w:r>
+              <w:rPr>
+                <w:b w:val="0"/>
+                <w:i w:val="0"/>
+                <w:sz w:val="18"/>
+              </w:rPr>
+              <w:t>Streptokinase</w:t>
+            </w:r>
+            <w:r>
+              <w:rPr>
+                <w:sz w:val="18"/>
+              </w:rPr>
+              <w:br/>
+            </w:r>
+            <w:r>
+              <w:rPr>
+                <w:b w:val="0"/>
+                <w:i w:val="0"/>
+                <w:sz w:val="18"/>
+              </w:rPr>
+              <w:t>fibrinolytic</w:t>
+            </w:r>
+          </w:p>
+        </w:tc>
+        <w:tc>
+          <w:tcPr>
+            <w:tcW w:type="dxa" w:w="2556"/>
+          </w:tcPr>
+          <w:p>
+            <w:pPr>
+              <w:spacing w:after="40"/>
+            </w:pPr>
+            <w:r>
+              <w:rPr>
+                <w:sz w:val="18"/>
+              </w:rPr>
+            </w:r>
+            <w:r>
+              <w:rPr>
+                <w:b w:val="0"/>
+                <w:i w:val="0"/>
+                <w:sz w:val="18"/>
+              </w:rPr>
+              <w:t>Contraindicated</w:t>
+            </w:r>
+          </w:p>
+        </w:tc>
+        <w:tc>
+          <w:tcPr>
+            <w:tcW w:type="dxa" w:w="2556"/>
+          </w:tcPr>
+          <w:p>
+            <w:pPr>
+              <w:spacing w:after="40"/>
+            </w:pPr>
+            <w:r>
+              <w:rPr>
+                <w:sz w:val="18"/>
+              </w:rPr>
+            </w:r>
+            <w:r>
+              <w:rPr>
+                <w:b/>
+                <w:i w:val="0"/>
+                <w:sz w:val="18"/>
+              </w:rPr>
+              <w:t>Prior streptokinase exposure or allergic reaction</w:t>
+            </w:r>
+            <w:r>
+              <w:rPr>
+                <w:b w:val="0"/>
+                <w:i w:val="0"/>
+                <w:sz w:val="18"/>
+              </w:rPr>
+              <w:t xml:space="preserve"> bars giving </w:t>
+            </w:r>
+            <w:r>
+              <w:rPr>
+                <w:b/>
+                <w:i w:val="0"/>
+                <w:sz w:val="18"/>
+              </w:rPr>
+              <w:t>streptokinase</w:t>
+            </w:r>
+            <w:r>
+              <w:rPr>
+                <w:b w:val="0"/>
+                <w:i w:val="0"/>
+                <w:sz w:val="18"/>
+              </w:rPr>
+              <w:t xml:space="preserve"> again (not the recombinant agents).</w:t>
+            </w:r>
+          </w:p>
+        </w:tc>
+        <w:tc>
+          <w:tcPr>
+            <w:tcW w:type="dxa" w:w="2556"/>
+          </w:tcPr>
+          <w:p>
+            <w:pPr>
+              <w:spacing w:after="40"/>
+            </w:pPr>
+            <w:r>
+              <w:rPr>
+                <w:sz w:val="18"/>
+              </w:rPr>
+            </w:r>
+            <w:r>
+              <w:rPr>
+                <w:b w:val="0"/>
+                <w:i w:val="0"/>
+                <w:sz w:val="18"/>
+              </w:rPr>
+              <w:t>L8</w:t>
+            </w:r>
+            <w:r>
+              <w:rPr>
+                <w:sz w:val="18"/>
+              </w:rPr>
+              <w:br/>
+            </w:r>
+            <w:r>
+              <w:rPr>
+                <w:b w:val="0"/>
+                <w:i w:val="0"/>
+                <w:sz w:val="18"/>
+              </w:rPr>
+              <w:t>slide 63</w:t>
+            </w:r>
+          </w:p>
+        </w:tc>
+      </w:tr>
+      <w:tr>
+        <w:tc>
+          <w:tcPr>
+            <w:tcW w:type="dxa" w:w="2556"/>
+          </w:tcPr>
+          <w:p>
+            <w:pPr>
+              <w:spacing w:after="40"/>
+            </w:pPr>
+            <w:r>
+              <w:rPr>
+                <w:sz w:val="18"/>
+              </w:rPr>
+            </w:r>
+            <w:r>
+              <w:rPr>
+                <w:b w:val="0"/>
+                <w:i w:val="0"/>
+                <w:sz w:val="18"/>
+              </w:rPr>
+              <w:t>Fibrinolytics</w:t>
+            </w:r>
+            <w:r>
+              <w:rPr>
+                <w:sz w:val="18"/>
+              </w:rPr>
+              <w:br/>
+            </w:r>
+            <w:r>
+              <w:rPr>
+                <w:b w:val="0"/>
+                <w:i w:val="0"/>
+                <w:sz w:val="18"/>
+              </w:rPr>
+              <w:t>streptokinase; alteplase (Activase), reteplase (Retavase), tenecteplase (TNKase)</w:t>
+            </w:r>
+          </w:p>
+        </w:tc>
+        <w:tc>
+          <w:tcPr>
+            <w:tcW w:type="dxa" w:w="2556"/>
+          </w:tcPr>
+          <w:p>
+            <w:pPr>
+              <w:spacing w:after="40"/>
+            </w:pPr>
+            <w:r>
+              <w:rPr>
+                <w:sz w:val="18"/>
+              </w:rPr>
+            </w:r>
+            <w:r>
+              <w:rPr>
+                <w:b w:val="0"/>
+                <w:i w:val="0"/>
+                <w:sz w:val="18"/>
+              </w:rPr>
+              <w:t>Caution</w:t>
+            </w:r>
+          </w:p>
+        </w:tc>
+        <w:tc>
+          <w:tcPr>
+            <w:tcW w:type="dxa" w:w="2556"/>
+          </w:tcPr>
+          <w:p>
+            <w:pPr>
+              <w:spacing w:after="40"/>
+            </w:pPr>
+            <w:r>
+              <w:rPr>
+                <w:sz w:val="18"/>
+              </w:rPr>
+            </w:r>
+            <w:r>
+              <w:rPr>
+                <w:b/>
+                <w:i w:val="0"/>
+                <w:sz w:val="18"/>
+              </w:rPr>
+              <w:t>Pregnancy</w:t>
+            </w:r>
+            <w:r>
+              <w:rPr>
+                <w:b w:val="0"/>
+                <w:i w:val="0"/>
+                <w:sz w:val="18"/>
+              </w:rPr>
+              <w:t xml:space="preserve"> (a relative contraindication in current guidelines).</w:t>
+            </w:r>
+          </w:p>
+        </w:tc>
+        <w:tc>
+          <w:tcPr>
+            <w:tcW w:type="dxa" w:w="2556"/>
+          </w:tcPr>
+          <w:p>
+            <w:pPr>
+              <w:spacing w:after="40"/>
+            </w:pPr>
+            <w:r>
+              <w:rPr>
+                <w:sz w:val="18"/>
+              </w:rPr>
+            </w:r>
+            <w:r>
+              <w:rPr>
+                <w:b w:val="0"/>
+                <w:i w:val="0"/>
+                <w:sz w:val="18"/>
+              </w:rPr>
+              <w:t>L8</w:t>
+            </w:r>
+            <w:r>
+              <w:rPr>
+                <w:sz w:val="18"/>
+              </w:rPr>
+              <w:br/>
+            </w:r>
+            <w:r>
+              <w:rPr>
+                <w:b w:val="0"/>
+                <w:i w:val="0"/>
+                <w:sz w:val="18"/>
+              </w:rPr>
+              <w:t>slide 63</w:t>
+            </w:r>
+          </w:p>
+        </w:tc>
+      </w:tr>
+      <w:tr>
+        <w:tc>
+          <w:tcPr>
+            <w:tcW w:type="dxa" w:w="2556"/>
+          </w:tcPr>
+          <w:p>
+            <w:pPr>
+              <w:spacing w:after="40"/>
+            </w:pPr>
+            <w:r>
+              <w:rPr>
+                <w:sz w:val="18"/>
+              </w:rPr>
+            </w:r>
+            <w:r>
+              <w:rPr>
+                <w:b w:val="0"/>
+                <w:i w:val="0"/>
+                <w:sz w:val="18"/>
+              </w:rPr>
+              <w:t>Fibrinolytics in non-ST-elevation acute coronary syndrome</w:t>
+            </w:r>
+          </w:p>
+        </w:tc>
+        <w:tc>
+          <w:tcPr>
+            <w:tcW w:type="dxa" w:w="2556"/>
+          </w:tcPr>
+          <w:p>
+            <w:pPr>
+              <w:spacing w:after="40"/>
+            </w:pPr>
+            <w:r>
+              <w:rPr>
+                <w:sz w:val="18"/>
+              </w:rPr>
+            </w:r>
+            <w:r>
+              <w:rPr>
+                <w:b w:val="0"/>
+                <w:i w:val="0"/>
+                <w:sz w:val="18"/>
+              </w:rPr>
+              <w:t>Avoid</w:t>
+            </w:r>
+          </w:p>
+        </w:tc>
+        <w:tc>
+          <w:tcPr>
+            <w:tcW w:type="dxa" w:w="2556"/>
+          </w:tcPr>
+          <w:p>
+            <w:pPr>
+              <w:spacing w:after="40"/>
+            </w:pPr>
+            <w:r>
+              <w:rPr>
+                <w:sz w:val="18"/>
+              </w:rPr>
+            </w:r>
+            <w:r>
+              <w:rPr>
+                <w:b/>
+                <w:i w:val="0"/>
+                <w:sz w:val="18"/>
+              </w:rPr>
+              <w:t>Not recommended</w:t>
+            </w:r>
+            <w:r>
+              <w:rPr>
+                <w:b w:val="0"/>
+                <w:i w:val="0"/>
+                <w:sz w:val="18"/>
+              </w:rPr>
+              <w:t>: the bleeding risk is greater than the benefit.</w:t>
+            </w:r>
+          </w:p>
+        </w:tc>
+        <w:tc>
+          <w:tcPr>
+            <w:tcW w:type="dxa" w:w="2556"/>
+          </w:tcPr>
+          <w:p>
+            <w:pPr>
+              <w:spacing w:after="40"/>
+            </w:pPr>
+            <w:r>
+              <w:rPr>
+                <w:sz w:val="18"/>
+              </w:rPr>
+            </w:r>
+            <w:r>
+              <w:rPr>
+                <w:b w:val="0"/>
+                <w:i w:val="0"/>
+                <w:sz w:val="18"/>
+              </w:rPr>
+              <w:t>L8</w:t>
+            </w:r>
+            <w:r>
+              <w:rPr>
+                <w:sz w:val="18"/>
+              </w:rPr>
+              <w:br/>
+            </w:r>
+            <w:r>
+              <w:rPr>
+                <w:b w:val="0"/>
+                <w:i w:val="0"/>
+                <w:sz w:val="18"/>
+              </w:rPr>
+              <w:t>slide 68</w:t>
+            </w:r>
+          </w:p>
+        </w:tc>
+      </w:tr>
+      <w:tr>
+        <w:tc>
+          <w:tcPr>
+            <w:tcW w:type="dxa" w:w="10224"/>
+            <w:gridSpan w:val="4"/>
+          </w:tcPr>
+          <w:p>
+            <w:pPr>
+              <w:spacing w:after="40"/>
+            </w:pPr>
+            <w:r/>
+          </w:p>
+        </w:tc>
+      </w:tr>
+      <w:tr>
+        <w:tc>
+          <w:tcPr>
+            <w:tcW w:type="dxa" w:w="2556"/>
+          </w:tcPr>
+          <w:p>
+            <w:pPr>
+              <w:spacing w:after="40"/>
+            </w:pPr>
+            <w:r>
+              <w:rPr>
+                <w:sz w:val="18"/>
+              </w:rPr>
+            </w:r>
+            <w:r>
+              <w:rPr>
+                <w:b w:val="0"/>
+                <w:i w:val="0"/>
+                <w:sz w:val="18"/>
+              </w:rPr>
+              <w:t>Morphine</w:t>
+            </w:r>
+            <w:r>
+              <w:rPr>
+                <w:sz w:val="18"/>
+              </w:rPr>
+              <w:br/>
+            </w:r>
+            <w:r>
+              <w:rPr>
+                <w:b w:val="0"/>
+                <w:i w:val="0"/>
+                <w:sz w:val="18"/>
+              </w:rPr>
+              <w:t>opioid analgesic</w:t>
+            </w:r>
+          </w:p>
+        </w:tc>
+        <w:tc>
+          <w:tcPr>
+            <w:tcW w:type="dxa" w:w="2556"/>
+          </w:tcPr>
+          <w:p>
+            <w:pPr>
+              <w:spacing w:after="40"/>
+            </w:pPr>
+            <w:r>
+              <w:rPr>
+                <w:sz w:val="18"/>
+              </w:rPr>
+            </w:r>
+            <w:r>
+              <w:rPr>
+                <w:b w:val="0"/>
+                <w:i w:val="0"/>
+                <w:sz w:val="18"/>
+              </w:rPr>
+              <w:t>Caution</w:t>
+            </w:r>
+          </w:p>
+        </w:tc>
+        <w:tc>
+          <w:tcPr>
+            <w:tcW w:type="dxa" w:w="2556"/>
+          </w:tcPr>
+          <w:p>
+            <w:pPr>
+              <w:spacing w:after="40"/>
+            </w:pPr>
+            <w:r>
+              <w:rPr>
+                <w:sz w:val="18"/>
+              </w:rPr>
+            </w:r>
+            <w:r>
+              <w:rPr>
+                <w:b/>
+                <w:i w:val="0"/>
+                <w:sz w:val="18"/>
+              </w:rPr>
+              <w:t>May increase mortality in unstable angina and non-ST-elevation myocardial infarction</w:t>
+            </w:r>
+            <w:r>
+              <w:rPr>
+                <w:b w:val="0"/>
+                <w:i w:val="0"/>
+                <w:sz w:val="18"/>
+              </w:rPr>
+              <w:t>; its use is controversial. Adverse reactions: hypotension and allergy.</w:t>
+            </w:r>
+          </w:p>
+        </w:tc>
+        <w:tc>
+          <w:tcPr>
+            <w:tcW w:type="dxa" w:w="2556"/>
+          </w:tcPr>
+          <w:p>
+            <w:pPr>
+              <w:spacing w:after="40"/>
+            </w:pPr>
+            <w:r>
+              <w:rPr>
+                <w:sz w:val="18"/>
+              </w:rPr>
+            </w:r>
+            <w:r>
+              <w:rPr>
+                <w:b w:val="0"/>
+                <w:i w:val="0"/>
+                <w:sz w:val="18"/>
+              </w:rPr>
+              <w:t>L8</w:t>
+            </w:r>
+            <w:r>
+              <w:rPr>
+                <w:sz w:val="18"/>
+              </w:rPr>
+              <w:br/>
+            </w:r>
+            <w:r>
+              <w:rPr>
+                <w:b w:val="0"/>
+                <w:i w:val="0"/>
+                <w:sz w:val="18"/>
+              </w:rPr>
+              <w:t>slide 56</w:t>
             </w:r>
           </w:p>
         </w:tc>

</xml_diff>